<commit_message>
Pujiang quote: add summary table, door-opening equipment 8 doors x 8k, sync section 5 with itemized quote (total 800k)
Co-Authored-By: Claude Sonnet 5.5 <noreply@anthropic.com>
Claude-Session: https://claude.ai/code/session_01DZcW8UzFAMq1wyGnVPG7By
</commit_message>
<xml_diff>
--- a/浦江/c-浦江网联试验室智能化提升项目（三期）建设方案.docx
+++ b/浦江/c-浦江网联试验室智能化提升项目（三期）建设方案.docx
@@ -1619,7 +1619,7 @@
               <w:szCs w:val="28"/>
               <w:lang w:val="en-US" w:eastAsia="zh-CN" w:bidi="ar-SA"/>
             </w:rPr>
-            <w:t>5.1 硬件报价清单</w:t>
+            <w:t>5.1 费用汇总</w:t>
           </w:r>
           <w:r>
             <w:tab/>
@@ -1666,7 +1666,7 @@
               <w:szCs w:val="28"/>
               <w:lang w:val="en-US" w:eastAsia="zh-CN" w:bidi="ar-SA"/>
             </w:rPr>
-            <w:t>5.2 软件报价清单</w:t>
+            <w:t>5.2 硬件报价清单</w:t>
           </w:r>
           <w:r>
             <w:tab/>
@@ -1682,6 +1682,53 @@
           </w:r>
           <w:r>
             <w:t>15</w:t>
+          </w:r>
+          <w:r>
+            <w:fldChar w:fldCharType="end"/>
+          </w:r>
+          <w:r>
+            <w:fldChar w:fldCharType="end"/>
+          </w:r>
+        </w:p>
+        <w:p>
+          <w:pPr>
+            <w:pStyle w:val="12"/>
+            <w:tabs>
+              <w:tab w:val="right" w:leader="dot" w:pos="8305"/>
+            </w:tabs>
+          </w:pPr>
+          <w:r>
+            <w:fldChar w:fldCharType="begin"/>
+          </w:r>
+          <w:r>
+            <w:instrText xml:space="preserve"> HYPERLINK \l _Toc900127 </w:instrText>
+          </w:r>
+          <w:r>
+            <w:fldChar w:fldCharType="separate"/>
+          </w:r>
+          <w:r>
+            <w:rPr>
+              <w:rFonts w:hint="eastAsia" w:ascii="宋体" w:hAnsi="宋体" w:eastAsia="宋体" w:cs="宋体"/>
+              <w:snapToGrid w:val="0"/>
+              <w:szCs w:val="28"/>
+              <w:lang w:val="en-US" w:eastAsia="zh-CN" w:bidi="ar-SA"/>
+            </w:rPr>
+            <w:t>5.3 软件报价清单</w:t>
+          </w:r>
+          <w:r>
+            <w:tab/>
+          </w:r>
+          <w:r>
+            <w:fldChar w:fldCharType="begin"/>
+          </w:r>
+          <w:r>
+            <w:instrText xml:space="preserve"> PAGEREF _Toc900127 \h </w:instrText>
+          </w:r>
+          <w:r>
+            <w:fldChar w:fldCharType="separate"/>
+          </w:r>
+          <w:r>
+            <w:t>16</w:t>
           </w:r>
           <w:r>
             <w:fldChar w:fldCharType="end"/>
@@ -9070,7 +9117,7 @@
           <w:szCs w:val="28"/>
           <w:lang w:val="en-US" w:eastAsia="zh-CN" w:bidi="ar-SA"/>
         </w:rPr>
-        <w:t>5.1 硬件报价清单</w:t>
+        <w:t>5.1 费用汇总</w:t>
       </w:r>
       <w:bookmarkEnd w:id="125"/>
     </w:p>
@@ -9096,15 +9143,8 @@
         </w:tblCellMar>
       </w:tblPr>
       <w:tblGrid>
-        <w:gridCol w:w="672"/>
-        <w:gridCol w:w="480"/>
-        <w:gridCol w:w="912"/>
-        <w:gridCol w:w="2400"/>
-        <w:gridCol w:w="432"/>
-        <w:gridCol w:w="528"/>
-        <w:gridCol w:w="960"/>
-        <w:gridCol w:w="1008"/>
-        <w:gridCol w:w="914"/>
+        <w:gridCol w:w="3322"/>
+        <w:gridCol w:w="4984"/>
       </w:tblGrid>
       <w:tr>
         <w:trPr>
@@ -9114,7 +9154,7 @@
         </w:trPr>
         <w:tc>
           <w:tcPr>
-            <w:tcW w:w="672" w:type="dxa"/>
+            <w:tcW w:w="3322" w:type="dxa"/>
             <w:shd w:val="clear" w:color="auto" w:fill="17365D"/>
             <w:tcMar>
               <w:top w:w="100" w:type="dxa"/>
@@ -9146,13 +9186,13 @@
                 <w:szCs w:val="18"/>
                 <w:lang w:val="en-US" w:eastAsia="zh-CN"/>
               </w:rPr>
-              <w:t xml:space="preserve">名称</w:t>
-            </w:r>
-          </w:p>
-        </w:tc>
-        <w:tc>
-          <w:tcPr>
-            <w:tcW w:w="480" w:type="dxa"/>
+              <w:t xml:space="preserve">项目</w:t>
+            </w:r>
+          </w:p>
+        </w:tc>
+        <w:tc>
+          <w:tcPr>
+            <w:tcW w:w="4984" w:type="dxa"/>
             <w:shd w:val="clear" w:color="auto" w:fill="17365D"/>
             <w:tcMar>
               <w:top w:w="100" w:type="dxa"/>
@@ -9184,273 +9224,7 @@
                 <w:szCs w:val="18"/>
                 <w:lang w:val="en-US" w:eastAsia="zh-CN"/>
               </w:rPr>
-              <w:t xml:space="preserve">序号</w:t>
-            </w:r>
-          </w:p>
-        </w:tc>
-        <w:tc>
-          <w:tcPr>
-            <w:tcW w:w="912" w:type="dxa"/>
-            <w:shd w:val="clear" w:color="auto" w:fill="17365D"/>
-            <w:tcMar>
-              <w:top w:w="100" w:type="dxa"/>
-              <w:left w:w="60" w:type="dxa"/>
-              <w:bottom w:w="100" w:type="dxa"/>
-              <w:right w:w="60" w:type="dxa"/>
-            </w:tcMar>
-            <w:vAlign w:val="center"/>
-          </w:tcPr>
-          <w:p>
-            <w:pPr>
-              <w:spacing w:before="0" w:after="0" w:line="269" w:lineRule="auto"/>
-              <w:jc w:val="center"/>
-              <w:rPr>
-                <w:rFonts w:hint="eastAsia" w:ascii="宋体" w:hAnsi="宋体" w:eastAsia="宋体" w:cs="宋体"/>
-                <w:b/>
-                <w:color w:val="FFFFFF"/>
-                <w:sz w:val="18"/>
-                <w:szCs w:val="18"/>
-                <w:lang w:val="en-US" w:eastAsia="zh-CN"/>
-              </w:rPr>
-            </w:pPr>
-            <w:r>
-              <w:rPr>
-                <w:rFonts w:hint="eastAsia" w:ascii="宋体" w:hAnsi="宋体" w:eastAsia="宋体" w:cs="宋体"/>
-                <w:b/>
-                <w:color w:val="FFFFFF"/>
-                <w:sz w:val="18"/>
-                <w:szCs w:val="18"/>
-                <w:lang w:val="en-US" w:eastAsia="zh-CN"/>
-              </w:rPr>
-              <w:t xml:space="preserve">模块名称</w:t>
-            </w:r>
-          </w:p>
-        </w:tc>
-        <w:tc>
-          <w:tcPr>
-            <w:tcW w:w="2400" w:type="dxa"/>
-            <w:shd w:val="clear" w:color="auto" w:fill="17365D"/>
-            <w:tcMar>
-              <w:top w:w="100" w:type="dxa"/>
-              <w:left w:w="60" w:type="dxa"/>
-              <w:bottom w:w="100" w:type="dxa"/>
-              <w:right w:w="60" w:type="dxa"/>
-            </w:tcMar>
-            <w:vAlign w:val="center"/>
-          </w:tcPr>
-          <w:p>
-            <w:pPr>
-              <w:spacing w:before="0" w:after="0" w:line="269" w:lineRule="auto"/>
-              <w:jc w:val="center"/>
-              <w:rPr>
-                <w:rFonts w:hint="eastAsia" w:ascii="宋体" w:hAnsi="宋体" w:eastAsia="宋体" w:cs="宋体"/>
-                <w:b/>
-                <w:color w:val="FFFFFF"/>
-                <w:sz w:val="18"/>
-                <w:szCs w:val="18"/>
-                <w:lang w:val="en-US" w:eastAsia="zh-CN"/>
-              </w:rPr>
-            </w:pPr>
-            <w:r>
-              <w:rPr>
-                <w:rFonts w:hint="eastAsia" w:ascii="宋体" w:hAnsi="宋体" w:eastAsia="宋体" w:cs="宋体"/>
-                <w:b/>
-                <w:color w:val="FFFFFF"/>
-                <w:sz w:val="18"/>
-                <w:szCs w:val="18"/>
-                <w:lang w:val="en-US" w:eastAsia="zh-CN"/>
-              </w:rPr>
-              <w:t xml:space="preserve">项目特征与需求描述</w:t>
-            </w:r>
-          </w:p>
-        </w:tc>
-        <w:tc>
-          <w:tcPr>
-            <w:tcW w:w="432" w:type="dxa"/>
-            <w:shd w:val="clear" w:color="auto" w:fill="17365D"/>
-            <w:tcMar>
-              <w:top w:w="100" w:type="dxa"/>
-              <w:left w:w="60" w:type="dxa"/>
-              <w:bottom w:w="100" w:type="dxa"/>
-              <w:right w:w="60" w:type="dxa"/>
-            </w:tcMar>
-            <w:vAlign w:val="center"/>
-          </w:tcPr>
-          <w:p>
-            <w:pPr>
-              <w:spacing w:before="0" w:after="0" w:line="269" w:lineRule="auto"/>
-              <w:jc w:val="center"/>
-              <w:rPr>
-                <w:rFonts w:hint="eastAsia" w:ascii="宋体" w:hAnsi="宋体" w:eastAsia="宋体" w:cs="宋体"/>
-                <w:b/>
-                <w:color w:val="FFFFFF"/>
-                <w:sz w:val="18"/>
-                <w:szCs w:val="18"/>
-                <w:lang w:val="en-US" w:eastAsia="zh-CN"/>
-              </w:rPr>
-            </w:pPr>
-            <w:r>
-              <w:rPr>
-                <w:rFonts w:hint="eastAsia" w:ascii="宋体" w:hAnsi="宋体" w:eastAsia="宋体" w:cs="宋体"/>
-                <w:b/>
-                <w:color w:val="FFFFFF"/>
-                <w:sz w:val="18"/>
-                <w:szCs w:val="18"/>
-                <w:lang w:val="en-US" w:eastAsia="zh-CN"/>
-              </w:rPr>
-              <w:t xml:space="preserve">单位</w:t>
-            </w:r>
-          </w:p>
-        </w:tc>
-        <w:tc>
-          <w:tcPr>
-            <w:tcW w:w="528" w:type="dxa"/>
-            <w:shd w:val="clear" w:color="auto" w:fill="17365D"/>
-            <w:tcMar>
-              <w:top w:w="100" w:type="dxa"/>
-              <w:left w:w="60" w:type="dxa"/>
-              <w:bottom w:w="100" w:type="dxa"/>
-              <w:right w:w="60" w:type="dxa"/>
-            </w:tcMar>
-            <w:vAlign w:val="center"/>
-          </w:tcPr>
-          <w:p>
-            <w:pPr>
-              <w:spacing w:before="0" w:after="0" w:line="269" w:lineRule="auto"/>
-              <w:jc w:val="center"/>
-              <w:rPr>
-                <w:rFonts w:hint="eastAsia" w:ascii="宋体" w:hAnsi="宋体" w:eastAsia="宋体" w:cs="宋体"/>
-                <w:b/>
-                <w:color w:val="FFFFFF"/>
-                <w:sz w:val="18"/>
-                <w:szCs w:val="18"/>
-                <w:lang w:val="en-US" w:eastAsia="zh-CN"/>
-              </w:rPr>
-            </w:pPr>
-            <w:r>
-              <w:rPr>
-                <w:rFonts w:hint="eastAsia" w:ascii="宋体" w:hAnsi="宋体" w:eastAsia="宋体" w:cs="宋体"/>
-                <w:b/>
-                <w:color w:val="FFFFFF"/>
-                <w:sz w:val="18"/>
-                <w:szCs w:val="18"/>
-                <w:lang w:val="en-US" w:eastAsia="zh-CN"/>
-              </w:rPr>
-              <w:t xml:space="preserve">工程量</w:t>
-            </w:r>
-          </w:p>
-        </w:tc>
-        <w:tc>
-          <w:tcPr>
-            <w:tcW w:w="960" w:type="dxa"/>
-            <w:shd w:val="clear" w:color="auto" w:fill="17365D"/>
-            <w:tcMar>
-              <w:top w:w="100" w:type="dxa"/>
-              <w:left w:w="60" w:type="dxa"/>
-              <w:bottom w:w="100" w:type="dxa"/>
-              <w:right w:w="60" w:type="dxa"/>
-            </w:tcMar>
-            <w:vAlign w:val="center"/>
-          </w:tcPr>
-          <w:p>
-            <w:pPr>
-              <w:spacing w:before="0" w:after="0" w:line="269" w:lineRule="auto"/>
-              <w:jc w:val="center"/>
-              <w:rPr>
-                <w:rFonts w:hint="eastAsia" w:ascii="宋体" w:hAnsi="宋体" w:eastAsia="宋体" w:cs="宋体"/>
-                <w:b/>
-                <w:color w:val="FFFFFF"/>
-                <w:sz w:val="18"/>
-                <w:szCs w:val="18"/>
-                <w:lang w:val="en-US" w:eastAsia="zh-CN"/>
-              </w:rPr>
-            </w:pPr>
-            <w:r>
-              <w:rPr>
-                <w:rFonts w:hint="eastAsia" w:ascii="宋体" w:hAnsi="宋体" w:eastAsia="宋体" w:cs="宋体"/>
-                <w:b/>
-                <w:color w:val="FFFFFF"/>
-                <w:sz w:val="18"/>
-                <w:szCs w:val="18"/>
-                <w:lang w:val="en-US" w:eastAsia="zh-CN"/>
-              </w:rPr>
-              <w:t xml:space="preserve">单价（元）</w:t>
-            </w:r>
-          </w:p>
-        </w:tc>
-        <w:tc>
-          <w:tcPr>
-            <w:tcW w:w="1008" w:type="dxa"/>
-            <w:shd w:val="clear" w:color="auto" w:fill="17365D"/>
-            <w:tcMar>
-              <w:top w:w="100" w:type="dxa"/>
-              <w:left w:w="60" w:type="dxa"/>
-              <w:bottom w:w="100" w:type="dxa"/>
-              <w:right w:w="60" w:type="dxa"/>
-            </w:tcMar>
-            <w:vAlign w:val="center"/>
-          </w:tcPr>
-          <w:p>
-            <w:pPr>
-              <w:spacing w:before="0" w:after="0" w:line="269" w:lineRule="auto"/>
-              <w:jc w:val="center"/>
-              <w:rPr>
-                <w:rFonts w:hint="eastAsia" w:ascii="宋体" w:hAnsi="宋体" w:eastAsia="宋体" w:cs="宋体"/>
-                <w:b/>
-                <w:color w:val="FFFFFF"/>
-                <w:sz w:val="18"/>
-                <w:szCs w:val="18"/>
-                <w:lang w:val="en-US" w:eastAsia="zh-CN"/>
-              </w:rPr>
-            </w:pPr>
-            <w:r>
-              <w:rPr>
-                <w:rFonts w:hint="eastAsia" w:ascii="宋体" w:hAnsi="宋体" w:eastAsia="宋体" w:cs="宋体"/>
-                <w:b/>
-                <w:color w:val="FFFFFF"/>
-                <w:sz w:val="18"/>
-                <w:szCs w:val="18"/>
-                <w:lang w:val="en-US" w:eastAsia="zh-CN"/>
-              </w:rPr>
-              <w:t xml:space="preserve">合价（元）</w:t>
-            </w:r>
-          </w:p>
-        </w:tc>
-        <w:tc>
-          <w:tcPr>
-            <w:tcW w:w="914" w:type="dxa"/>
-            <w:shd w:val="clear" w:color="auto" w:fill="17365D"/>
-            <w:tcMar>
-              <w:top w:w="100" w:type="dxa"/>
-              <w:left w:w="60" w:type="dxa"/>
-              <w:bottom w:w="100" w:type="dxa"/>
-              <w:right w:w="60" w:type="dxa"/>
-            </w:tcMar>
-            <w:vAlign w:val="center"/>
-          </w:tcPr>
-          <w:p>
-            <w:pPr>
-              <w:spacing w:before="0" w:after="0" w:line="269" w:lineRule="auto"/>
-              <w:jc w:val="center"/>
-              <w:rPr>
-                <w:rFonts w:hint="eastAsia" w:ascii="宋体" w:hAnsi="宋体" w:eastAsia="宋体" w:cs="宋体"/>
-                <w:b/>
-                <w:color w:val="FFFFFF"/>
-                <w:sz w:val="18"/>
-                <w:szCs w:val="18"/>
-                <w:lang w:val="en-US" w:eastAsia="zh-CN"/>
-              </w:rPr>
-            </w:pPr>
-            <w:r>
-              <w:rPr>
-                <w:rFonts w:hint="eastAsia" w:ascii="宋体" w:hAnsi="宋体" w:eastAsia="宋体" w:cs="宋体"/>
-                <w:b/>
-                <w:color w:val="FFFFFF"/>
-                <w:sz w:val="18"/>
-                <w:szCs w:val="18"/>
-                <w:lang w:val="en-US" w:eastAsia="zh-CN"/>
-              </w:rPr>
-              <w:t xml:space="preserve">备注</w:t>
+              <w:t xml:space="preserve">金额（元）</w:t>
             </w:r>
           </w:p>
         </w:tc>
@@ -9462,7 +9236,7 @@
         </w:trPr>
         <w:tc>
           <w:tcPr>
-            <w:tcW w:w="672" w:type="dxa"/>
+            <w:tcW w:w="3322" w:type="dxa"/>
             <w:tcMar>
               <w:top w:w="100" w:type="dxa"/>
               <w:left w:w="60" w:type="dxa"/>
@@ -9491,287 +9265,42 @@
                 <w:szCs w:val="18"/>
                 <w:lang w:val="en-US" w:eastAsia="zh-CN"/>
               </w:rPr>
-              <w:t xml:space="preserve">样品运输设备</w:t>
-            </w:r>
-          </w:p>
-        </w:tc>
-        <w:tc>
-          <w:tcPr>
-            <w:tcW w:w="480" w:type="dxa"/>
-            <w:tcMar>
-              <w:top w:w="100" w:type="dxa"/>
-              <w:left w:w="60" w:type="dxa"/>
-              <w:bottom w:w="100" w:type="dxa"/>
-              <w:right w:w="60" w:type="dxa"/>
-            </w:tcMar>
-            <w:vAlign w:val="center"/>
-          </w:tcPr>
-          <w:p>
-            <w:pPr>
-              <w:spacing w:before="0" w:after="0" w:line="269" w:lineRule="auto"/>
-              <w:jc w:val="left"/>
-              <w:rPr>
-                <w:rFonts w:hint="eastAsia" w:ascii="宋体" w:hAnsi="宋体" w:eastAsia="宋体" w:cs="宋体"/>
-                <w:color w:val="000000"/>
-                <w:sz w:val="18"/>
-                <w:szCs w:val="18"/>
-                <w:lang w:val="en-US" w:eastAsia="zh-CN"/>
-              </w:rPr>
-            </w:pPr>
-            <w:r>
-              <w:rPr>
-                <w:rFonts w:hint="eastAsia" w:ascii="宋体" w:hAnsi="宋体" w:eastAsia="宋体" w:cs="宋体"/>
-                <w:color w:val="000000"/>
-                <w:sz w:val="18"/>
-                <w:szCs w:val="18"/>
-                <w:lang w:val="en-US" w:eastAsia="zh-CN"/>
-              </w:rPr>
-              <w:t xml:space="preserve">1</w:t>
-            </w:r>
-          </w:p>
-        </w:tc>
-        <w:tc>
-          <w:tcPr>
-            <w:tcW w:w="912" w:type="dxa"/>
-            <w:tcMar>
-              <w:top w:w="100" w:type="dxa"/>
-              <w:left w:w="60" w:type="dxa"/>
-              <w:bottom w:w="100" w:type="dxa"/>
-              <w:right w:w="60" w:type="dxa"/>
-            </w:tcMar>
-            <w:vAlign w:val="center"/>
-          </w:tcPr>
-          <w:p>
-            <w:pPr>
-              <w:spacing w:before="0" w:after="0" w:line="269" w:lineRule="auto"/>
-              <w:jc w:val="left"/>
-              <w:rPr>
-                <w:rFonts w:hint="eastAsia" w:ascii="宋体" w:hAnsi="宋体" w:eastAsia="宋体" w:cs="宋体"/>
-                <w:color w:val="000000"/>
-                <w:sz w:val="18"/>
-                <w:szCs w:val="18"/>
-                <w:lang w:val="en-US" w:eastAsia="zh-CN"/>
-              </w:rPr>
-            </w:pPr>
-            <w:r>
-              <w:rPr>
-                <w:rFonts w:hint="eastAsia" w:ascii="宋体" w:hAnsi="宋体" w:eastAsia="宋体" w:cs="宋体"/>
-                <w:color w:val="000000"/>
-                <w:sz w:val="18"/>
-                <w:szCs w:val="18"/>
-                <w:lang w:val="en-US" w:eastAsia="zh-CN"/>
-              </w:rPr>
-              <w:t xml:space="preserve">样品运输机器人</w:t>
-            </w:r>
-          </w:p>
-        </w:tc>
-        <w:tc>
-          <w:tcPr>
-            <w:tcW w:w="2400" w:type="dxa"/>
-            <w:tcMar>
-              <w:top w:w="100" w:type="dxa"/>
-              <w:left w:w="60" w:type="dxa"/>
-              <w:bottom w:w="100" w:type="dxa"/>
-              <w:right w:w="60" w:type="dxa"/>
-            </w:tcMar>
-            <w:vAlign w:val="center"/>
-          </w:tcPr>
-          <w:p>
-            <w:pPr>
-              <w:spacing w:before="0" w:after="0" w:line="269" w:lineRule="auto"/>
-              <w:jc w:val="left"/>
-              <w:rPr>
-                <w:rFonts w:hint="eastAsia" w:ascii="宋体" w:hAnsi="宋体" w:eastAsia="宋体" w:cs="宋体"/>
-                <w:color w:val="000000"/>
-                <w:sz w:val="18"/>
-                <w:szCs w:val="18"/>
-                <w:lang w:val="en-US" w:eastAsia="zh-CN"/>
-              </w:rPr>
-            </w:pPr>
-            <w:r>
-              <w:rPr>
-                <w:rFonts w:hint="eastAsia" w:ascii="宋体" w:hAnsi="宋体" w:eastAsia="宋体" w:cs="宋体"/>
-                <w:color w:val="000000"/>
-                <w:sz w:val="18"/>
-                <w:szCs w:val="18"/>
-                <w:lang w:val="en-US" w:eastAsia="zh-CN"/>
-              </w:rPr>
-              <w:t xml:space="preserve">X300B工业搬运机器人，双轮差速驱动，激光SLAM导航，举升高度60 mm，导航到点精度&lt;±20 mm；含电池、自动回充桩、调度管理系统授权及现场建图调试</w:t>
-            </w:r>
-          </w:p>
-        </w:tc>
-        <w:tc>
-          <w:tcPr>
-            <w:tcW w:w="432" w:type="dxa"/>
-            <w:tcMar>
-              <w:top w:w="100" w:type="dxa"/>
-              <w:left w:w="60" w:type="dxa"/>
-              <w:bottom w:w="100" w:type="dxa"/>
-              <w:right w:w="60" w:type="dxa"/>
-            </w:tcMar>
-            <w:vAlign w:val="center"/>
-          </w:tcPr>
-          <w:p>
-            <w:pPr>
-              <w:spacing w:before="0" w:after="0" w:line="269" w:lineRule="auto"/>
-              <w:jc w:val="left"/>
-              <w:rPr>
-                <w:rFonts w:hint="eastAsia" w:ascii="宋体" w:hAnsi="宋体" w:eastAsia="宋体" w:cs="宋体"/>
-                <w:color w:val="000000"/>
-                <w:sz w:val="18"/>
-                <w:szCs w:val="18"/>
-                <w:lang w:val="en-US" w:eastAsia="zh-CN"/>
-              </w:rPr>
-            </w:pPr>
-            <w:r>
-              <w:rPr>
-                <w:rFonts w:hint="eastAsia" w:ascii="宋体" w:hAnsi="宋体" w:eastAsia="宋体" w:cs="宋体"/>
-                <w:color w:val="000000"/>
-                <w:sz w:val="18"/>
-                <w:szCs w:val="18"/>
-                <w:lang w:val="en-US" w:eastAsia="zh-CN"/>
-              </w:rPr>
-              <w:t xml:space="preserve">台</w:t>
-            </w:r>
-          </w:p>
-        </w:tc>
-        <w:tc>
-          <w:tcPr>
-            <w:tcW w:w="528" w:type="dxa"/>
-            <w:tcMar>
-              <w:top w:w="100" w:type="dxa"/>
-              <w:left w:w="60" w:type="dxa"/>
-              <w:bottom w:w="100" w:type="dxa"/>
-              <w:right w:w="60" w:type="dxa"/>
-            </w:tcMar>
-            <w:vAlign w:val="center"/>
-          </w:tcPr>
-          <w:p>
-            <w:pPr>
-              <w:spacing w:before="0" w:after="0" w:line="269" w:lineRule="auto"/>
-              <w:jc w:val="left"/>
-              <w:rPr>
-                <w:rFonts w:hint="eastAsia" w:ascii="宋体" w:hAnsi="宋体" w:eastAsia="宋体" w:cs="宋体"/>
-                <w:color w:val="000000"/>
-                <w:sz w:val="18"/>
-                <w:szCs w:val="18"/>
-                <w:lang w:val="en-US" w:eastAsia="zh-CN"/>
-              </w:rPr>
-            </w:pPr>
-            <w:r>
-              <w:rPr>
-                <w:rFonts w:hint="eastAsia" w:ascii="宋体" w:hAnsi="宋体" w:eastAsia="宋体" w:cs="宋体"/>
-                <w:color w:val="000000"/>
-                <w:sz w:val="18"/>
-                <w:szCs w:val="18"/>
-                <w:lang w:val="en-US" w:eastAsia="zh-CN"/>
-              </w:rPr>
-              <w:t xml:space="preserve">2</w:t>
-            </w:r>
-          </w:p>
-        </w:tc>
-        <w:tc>
-          <w:tcPr>
-            <w:tcW w:w="960" w:type="dxa"/>
-            <w:tcMar>
-              <w:top w:w="100" w:type="dxa"/>
-              <w:left w:w="60" w:type="dxa"/>
-              <w:bottom w:w="100" w:type="dxa"/>
-              <w:right w:w="60" w:type="dxa"/>
-            </w:tcMar>
-            <w:vAlign w:val="center"/>
-          </w:tcPr>
-          <w:p>
-            <w:pPr>
-              <w:spacing w:before="0" w:after="0" w:line="269" w:lineRule="auto"/>
-              <w:jc w:val="left"/>
-              <w:rPr>
-                <w:rFonts w:hint="eastAsia" w:ascii="宋体" w:hAnsi="宋体" w:eastAsia="宋体" w:cs="宋体"/>
-                <w:color w:val="000000"/>
-                <w:sz w:val="18"/>
-                <w:szCs w:val="18"/>
-                <w:lang w:val="en-US" w:eastAsia="zh-CN"/>
-              </w:rPr>
-            </w:pPr>
-            <w:r>
-              <w:rPr>
-                <w:rFonts w:hint="eastAsia" w:ascii="宋体" w:hAnsi="宋体" w:eastAsia="宋体" w:cs="宋体"/>
-                <w:color w:val="000000"/>
-                <w:sz w:val="18"/>
-                <w:szCs w:val="18"/>
-                <w:lang w:val="en-US" w:eastAsia="zh-CN"/>
-              </w:rPr>
-              <w:t xml:space="preserve">100,000</w:t>
-            </w:r>
-          </w:p>
-        </w:tc>
-        <w:tc>
-          <w:tcPr>
-            <w:tcW w:w="1008" w:type="dxa"/>
-            <w:tcMar>
-              <w:top w:w="100" w:type="dxa"/>
-              <w:left w:w="60" w:type="dxa"/>
-              <w:bottom w:w="100" w:type="dxa"/>
-              <w:right w:w="60" w:type="dxa"/>
-            </w:tcMar>
-            <w:vAlign w:val="center"/>
-          </w:tcPr>
-          <w:p>
-            <w:pPr>
-              <w:spacing w:before="0" w:after="0" w:line="269" w:lineRule="auto"/>
-              <w:jc w:val="left"/>
-              <w:rPr>
-                <w:rFonts w:hint="eastAsia" w:ascii="宋体" w:hAnsi="宋体" w:eastAsia="宋体" w:cs="宋体"/>
-                <w:color w:val="000000"/>
-                <w:sz w:val="18"/>
-                <w:szCs w:val="18"/>
-                <w:lang w:val="en-US" w:eastAsia="zh-CN"/>
-              </w:rPr>
-            </w:pPr>
-            <w:r>
-              <w:rPr>
-                <w:rFonts w:hint="eastAsia" w:ascii="宋体" w:hAnsi="宋体" w:eastAsia="宋体" w:cs="宋体"/>
-                <w:color w:val="000000"/>
-                <w:sz w:val="18"/>
-                <w:szCs w:val="18"/>
-                <w:lang w:val="en-US" w:eastAsia="zh-CN"/>
-              </w:rPr>
-              <w:t xml:space="preserve">200,000</w:t>
-            </w:r>
-          </w:p>
-        </w:tc>
-        <w:tc>
-          <w:tcPr>
-            <w:tcW w:w="914" w:type="dxa"/>
-            <w:tcMar>
-              <w:top w:w="100" w:type="dxa"/>
-              <w:left w:w="60" w:type="dxa"/>
-              <w:bottom w:w="100" w:type="dxa"/>
-              <w:right w:w="60" w:type="dxa"/>
-            </w:tcMar>
-            <w:vAlign w:val="center"/>
-          </w:tcPr>
-          <w:p>
-            <w:pPr>
-              <w:spacing w:before="0" w:after="0" w:line="269" w:lineRule="auto"/>
-              <w:jc w:val="left"/>
-              <w:rPr>
-                <w:rFonts w:hint="eastAsia" w:ascii="宋体" w:hAnsi="宋体" w:eastAsia="宋体" w:cs="宋体"/>
-                <w:color w:val="000000"/>
-                <w:sz w:val="18"/>
-                <w:szCs w:val="18"/>
-                <w:lang w:val="en-US" w:eastAsia="zh-CN"/>
-              </w:rPr>
-            </w:pPr>
-            <w:r>
-              <w:rPr>
-                <w:rFonts w:hint="eastAsia" w:ascii="宋体" w:hAnsi="宋体" w:eastAsia="宋体" w:cs="宋体"/>
-                <w:color w:val="000000"/>
-                <w:sz w:val="18"/>
-                <w:szCs w:val="18"/>
-                <w:lang w:val="en-US" w:eastAsia="zh-CN"/>
-              </w:rPr>
-              <w:t xml:space="preserve">单台10万元</w:t>
+              <w:t xml:space="preserve">硬件总价</w:t>
+            </w:r>
+          </w:p>
+        </w:tc>
+        <w:tc>
+          <w:tcPr>
+            <w:tcW w:w="4984" w:type="dxa"/>
+            <w:tcMar>
+              <w:top w:w="100" w:type="dxa"/>
+              <w:left w:w="60" w:type="dxa"/>
+              <w:bottom w:w="100" w:type="dxa"/>
+              <w:right w:w="60" w:type="dxa"/>
+            </w:tcMar>
+            <w:vAlign w:val="center"/>
+          </w:tcPr>
+          <w:p>
+            <w:pPr>
+              <w:spacing w:before="0" w:after="0" w:line="269" w:lineRule="auto"/>
+              <w:jc w:val="left"/>
+              <w:rPr>
+                <w:rFonts w:hint="eastAsia" w:ascii="宋体" w:hAnsi="宋体" w:eastAsia="宋体" w:cs="宋体"/>
+                <w:color w:val="000000"/>
+                <w:sz w:val="18"/>
+                <w:szCs w:val="18"/>
+                <w:lang w:val="en-US" w:eastAsia="zh-CN"/>
+              </w:rPr>
+            </w:pPr>
+            <w:r>
+              <w:rPr>
+                <w:rFonts w:hint="eastAsia" w:ascii="宋体" w:hAnsi="宋体" w:eastAsia="宋体" w:cs="宋体"/>
+                <w:color w:val="000000"/>
+                <w:sz w:val="18"/>
+                <w:szCs w:val="18"/>
+                <w:lang w:val="en-US" w:eastAsia="zh-CN"/>
+              </w:rPr>
+              <w:t xml:space="preserve">284,000</w:t>
             </w:r>
           </w:p>
         </w:tc>
@@ -9783,7 +9312,7 @@
         </w:trPr>
         <w:tc>
           <w:tcPr>
-            <w:tcW w:w="672" w:type="dxa"/>
+            <w:tcW w:w="3322" w:type="dxa"/>
             <w:tcMar>
               <w:top w:w="100" w:type="dxa"/>
               <w:left w:w="60" w:type="dxa"/>
@@ -9812,287 +9341,42 @@
                 <w:szCs w:val="18"/>
                 <w:lang w:val="en-US" w:eastAsia="zh-CN"/>
               </w:rPr>
-              <w:t xml:space="preserve">门禁与显示设备</w:t>
-            </w:r>
-          </w:p>
-        </w:tc>
-        <w:tc>
-          <w:tcPr>
-            <w:tcW w:w="480" w:type="dxa"/>
-            <w:tcMar>
-              <w:top w:w="100" w:type="dxa"/>
-              <w:left w:w="60" w:type="dxa"/>
-              <w:bottom w:w="100" w:type="dxa"/>
-              <w:right w:w="60" w:type="dxa"/>
-            </w:tcMar>
-            <w:vAlign w:val="center"/>
-          </w:tcPr>
-          <w:p>
-            <w:pPr>
-              <w:spacing w:before="0" w:after="0" w:line="269" w:lineRule="auto"/>
-              <w:jc w:val="left"/>
-              <w:rPr>
-                <w:rFonts w:hint="eastAsia" w:ascii="宋体" w:hAnsi="宋体" w:eastAsia="宋体" w:cs="宋体"/>
-                <w:color w:val="000000"/>
-                <w:sz w:val="18"/>
-                <w:szCs w:val="18"/>
-                <w:lang w:val="en-US" w:eastAsia="zh-CN"/>
-              </w:rPr>
-            </w:pPr>
-            <w:r>
-              <w:rPr>
-                <w:rFonts w:hint="eastAsia" w:ascii="宋体" w:hAnsi="宋体" w:eastAsia="宋体" w:cs="宋体"/>
-                <w:color w:val="000000"/>
-                <w:sz w:val="18"/>
-                <w:szCs w:val="18"/>
-                <w:lang w:val="en-US" w:eastAsia="zh-CN"/>
-              </w:rPr>
-              <w:t xml:space="preserve">2</w:t>
-            </w:r>
-          </w:p>
-        </w:tc>
-        <w:tc>
-          <w:tcPr>
-            <w:tcW w:w="912" w:type="dxa"/>
-            <w:tcMar>
-              <w:top w:w="100" w:type="dxa"/>
-              <w:left w:w="60" w:type="dxa"/>
-              <w:bottom w:w="100" w:type="dxa"/>
-              <w:right w:w="60" w:type="dxa"/>
-            </w:tcMar>
-            <w:vAlign w:val="center"/>
-          </w:tcPr>
-          <w:p>
-            <w:pPr>
-              <w:spacing w:before="0" w:after="0" w:line="269" w:lineRule="auto"/>
-              <w:jc w:val="left"/>
-              <w:rPr>
-                <w:rFonts w:hint="eastAsia" w:ascii="宋体" w:hAnsi="宋体" w:eastAsia="宋体" w:cs="宋体"/>
-                <w:color w:val="000000"/>
-                <w:sz w:val="18"/>
-                <w:szCs w:val="18"/>
-                <w:lang w:val="en-US" w:eastAsia="zh-CN"/>
-              </w:rPr>
-            </w:pPr>
-            <w:r>
-              <w:rPr>
-                <w:rFonts w:hint="eastAsia" w:ascii="宋体" w:hAnsi="宋体" w:eastAsia="宋体" w:cs="宋体"/>
-                <w:color w:val="000000"/>
-                <w:sz w:val="18"/>
-                <w:szCs w:val="18"/>
-                <w:lang w:val="en-US" w:eastAsia="zh-CN"/>
-              </w:rPr>
-              <w:t xml:space="preserve">运输机器人联动改造</w:t>
-            </w:r>
-          </w:p>
-        </w:tc>
-        <w:tc>
-          <w:tcPr>
-            <w:tcW w:w="2400" w:type="dxa"/>
-            <w:tcMar>
-              <w:top w:w="100" w:type="dxa"/>
-              <w:left w:w="60" w:type="dxa"/>
-              <w:bottom w:w="100" w:type="dxa"/>
-              <w:right w:w="60" w:type="dxa"/>
-            </w:tcMar>
-            <w:vAlign w:val="center"/>
-          </w:tcPr>
-          <w:p>
-            <w:pPr>
-              <w:spacing w:before="0" w:after="0" w:line="269" w:lineRule="auto"/>
-              <w:jc w:val="left"/>
-              <w:rPr>
-                <w:rFonts w:hint="eastAsia" w:ascii="宋体" w:hAnsi="宋体" w:eastAsia="宋体" w:cs="宋体"/>
-                <w:color w:val="000000"/>
-                <w:sz w:val="18"/>
-                <w:szCs w:val="18"/>
-                <w:lang w:val="en-US" w:eastAsia="zh-CN"/>
-              </w:rPr>
-            </w:pPr>
-            <w:r>
-              <w:rPr>
-                <w:rFonts w:hint="eastAsia" w:ascii="宋体" w:hAnsi="宋体" w:eastAsia="宋体" w:cs="宋体"/>
-                <w:color w:val="000000"/>
-                <w:sz w:val="18"/>
-                <w:szCs w:val="18"/>
-                <w:lang w:val="en-US" w:eastAsia="zh-CN"/>
-              </w:rPr>
-              <w:t xml:space="preserve">运输路线上的试验室门体加装联动控制器与电动开门机，具备开门、关门及到位信号输出</w:t>
-            </w:r>
-          </w:p>
-        </w:tc>
-        <w:tc>
-          <w:tcPr>
-            <w:tcW w:w="432" w:type="dxa"/>
-            <w:tcMar>
-              <w:top w:w="100" w:type="dxa"/>
-              <w:left w:w="60" w:type="dxa"/>
-              <w:bottom w:w="100" w:type="dxa"/>
-              <w:right w:w="60" w:type="dxa"/>
-            </w:tcMar>
-            <w:vAlign w:val="center"/>
-          </w:tcPr>
-          <w:p>
-            <w:pPr>
-              <w:spacing w:before="0" w:after="0" w:line="269" w:lineRule="auto"/>
-              <w:jc w:val="left"/>
-              <w:rPr>
-                <w:rFonts w:hint="eastAsia" w:ascii="宋体" w:hAnsi="宋体" w:eastAsia="宋体" w:cs="宋体"/>
-                <w:color w:val="000000"/>
-                <w:sz w:val="18"/>
-                <w:szCs w:val="18"/>
-                <w:lang w:val="en-US" w:eastAsia="zh-CN"/>
-              </w:rPr>
-            </w:pPr>
-            <w:r>
-              <w:rPr>
-                <w:rFonts w:hint="eastAsia" w:ascii="宋体" w:hAnsi="宋体" w:eastAsia="宋体" w:cs="宋体"/>
-                <w:color w:val="000000"/>
-                <w:sz w:val="18"/>
-                <w:szCs w:val="18"/>
-                <w:lang w:val="en-US" w:eastAsia="zh-CN"/>
-              </w:rPr>
-              <w:t xml:space="preserve">扇</w:t>
-            </w:r>
-          </w:p>
-        </w:tc>
-        <w:tc>
-          <w:tcPr>
-            <w:tcW w:w="528" w:type="dxa"/>
-            <w:tcMar>
-              <w:top w:w="100" w:type="dxa"/>
-              <w:left w:w="60" w:type="dxa"/>
-              <w:bottom w:w="100" w:type="dxa"/>
-              <w:right w:w="60" w:type="dxa"/>
-            </w:tcMar>
-            <w:vAlign w:val="center"/>
-          </w:tcPr>
-          <w:p>
-            <w:pPr>
-              <w:spacing w:before="0" w:after="0" w:line="269" w:lineRule="auto"/>
-              <w:jc w:val="left"/>
-              <w:rPr>
-                <w:rFonts w:hint="eastAsia" w:ascii="宋体" w:hAnsi="宋体" w:eastAsia="宋体" w:cs="宋体"/>
-                <w:color w:val="000000"/>
-                <w:sz w:val="18"/>
-                <w:szCs w:val="18"/>
-                <w:lang w:val="en-US" w:eastAsia="zh-CN"/>
-              </w:rPr>
-            </w:pPr>
-            <w:r>
-              <w:rPr>
-                <w:rFonts w:hint="eastAsia" w:ascii="宋体" w:hAnsi="宋体" w:eastAsia="宋体" w:cs="宋体"/>
-                <w:color w:val="000000"/>
-                <w:sz w:val="18"/>
-                <w:szCs w:val="18"/>
-                <w:lang w:val="en-US" w:eastAsia="zh-CN"/>
-              </w:rPr>
-              <w:t xml:space="preserve">4</w:t>
-            </w:r>
-          </w:p>
-        </w:tc>
-        <w:tc>
-          <w:tcPr>
-            <w:tcW w:w="960" w:type="dxa"/>
-            <w:tcMar>
-              <w:top w:w="100" w:type="dxa"/>
-              <w:left w:w="60" w:type="dxa"/>
-              <w:bottom w:w="100" w:type="dxa"/>
-              <w:right w:w="60" w:type="dxa"/>
-            </w:tcMar>
-            <w:vAlign w:val="center"/>
-          </w:tcPr>
-          <w:p>
-            <w:pPr>
-              <w:spacing w:before="0" w:after="0" w:line="269" w:lineRule="auto"/>
-              <w:jc w:val="left"/>
-              <w:rPr>
-                <w:rFonts w:hint="eastAsia" w:ascii="宋体" w:hAnsi="宋体" w:eastAsia="宋体" w:cs="宋体"/>
-                <w:color w:val="000000"/>
-                <w:sz w:val="18"/>
-                <w:szCs w:val="18"/>
-                <w:lang w:val="en-US" w:eastAsia="zh-CN"/>
-              </w:rPr>
-            </w:pPr>
-            <w:r>
-              <w:rPr>
-                <w:rFonts w:hint="eastAsia" w:ascii="宋体" w:hAnsi="宋体" w:eastAsia="宋体" w:cs="宋体"/>
-                <w:color w:val="000000"/>
-                <w:sz w:val="18"/>
-                <w:szCs w:val="18"/>
-                <w:lang w:val="en-US" w:eastAsia="zh-CN"/>
-              </w:rPr>
-              <w:t xml:space="preserve">6,000</w:t>
-            </w:r>
-          </w:p>
-        </w:tc>
-        <w:tc>
-          <w:tcPr>
-            <w:tcW w:w="1008" w:type="dxa"/>
-            <w:tcMar>
-              <w:top w:w="100" w:type="dxa"/>
-              <w:left w:w="60" w:type="dxa"/>
-              <w:bottom w:w="100" w:type="dxa"/>
-              <w:right w:w="60" w:type="dxa"/>
-            </w:tcMar>
-            <w:vAlign w:val="center"/>
-          </w:tcPr>
-          <w:p>
-            <w:pPr>
-              <w:spacing w:before="0" w:after="0" w:line="269" w:lineRule="auto"/>
-              <w:jc w:val="left"/>
-              <w:rPr>
-                <w:rFonts w:hint="eastAsia" w:ascii="宋体" w:hAnsi="宋体" w:eastAsia="宋体" w:cs="宋体"/>
-                <w:color w:val="000000"/>
-                <w:sz w:val="18"/>
-                <w:szCs w:val="18"/>
-                <w:lang w:val="en-US" w:eastAsia="zh-CN"/>
-              </w:rPr>
-            </w:pPr>
-            <w:r>
-              <w:rPr>
-                <w:rFonts w:hint="eastAsia" w:ascii="宋体" w:hAnsi="宋体" w:eastAsia="宋体" w:cs="宋体"/>
-                <w:color w:val="000000"/>
-                <w:sz w:val="18"/>
-                <w:szCs w:val="18"/>
-                <w:lang w:val="en-US" w:eastAsia="zh-CN"/>
-              </w:rPr>
-              <w:t xml:space="preserve">24,000</w:t>
-            </w:r>
-          </w:p>
-        </w:tc>
-        <w:tc>
-          <w:tcPr>
-            <w:tcW w:w="914" w:type="dxa"/>
-            <w:tcMar>
-              <w:top w:w="100" w:type="dxa"/>
-              <w:left w:w="60" w:type="dxa"/>
-              <w:bottom w:w="100" w:type="dxa"/>
-              <w:right w:w="60" w:type="dxa"/>
-            </w:tcMar>
-            <w:vAlign w:val="center"/>
-          </w:tcPr>
-          <w:p>
-            <w:pPr>
-              <w:spacing w:before="0" w:after="0" w:line="269" w:lineRule="auto"/>
-              <w:jc w:val="left"/>
-              <w:rPr>
-                <w:rFonts w:hint="eastAsia" w:ascii="宋体" w:hAnsi="宋体" w:eastAsia="宋体" w:cs="宋体"/>
-                <w:color w:val="000000"/>
-                <w:sz w:val="18"/>
-                <w:szCs w:val="18"/>
-                <w:lang w:val="en-US" w:eastAsia="zh-CN"/>
-              </w:rPr>
-            </w:pPr>
-            <w:r>
-              <w:rPr>
-                <w:rFonts w:hint="eastAsia" w:ascii="宋体" w:hAnsi="宋体" w:eastAsia="宋体" w:cs="宋体"/>
-                <w:color w:val="000000"/>
-                <w:sz w:val="18"/>
-                <w:szCs w:val="18"/>
-                <w:lang w:val="en-US" w:eastAsia="zh-CN"/>
-              </w:rPr>
-              <w:t xml:space="preserve">含安装；数量以现场勘查为准</w:t>
+              <w:t xml:space="preserve">软件总价</w:t>
+            </w:r>
+          </w:p>
+        </w:tc>
+        <w:tc>
+          <w:tcPr>
+            <w:tcW w:w="4984" w:type="dxa"/>
+            <w:tcMar>
+              <w:top w:w="100" w:type="dxa"/>
+              <w:left w:w="60" w:type="dxa"/>
+              <w:bottom w:w="100" w:type="dxa"/>
+              <w:right w:w="60" w:type="dxa"/>
+            </w:tcMar>
+            <w:vAlign w:val="center"/>
+          </w:tcPr>
+          <w:p>
+            <w:pPr>
+              <w:spacing w:before="0" w:after="0" w:line="269" w:lineRule="auto"/>
+              <w:jc w:val="left"/>
+              <w:rPr>
+                <w:rFonts w:hint="eastAsia" w:ascii="宋体" w:hAnsi="宋体" w:eastAsia="宋体" w:cs="宋体"/>
+                <w:color w:val="000000"/>
+                <w:sz w:val="18"/>
+                <w:szCs w:val="18"/>
+                <w:lang w:val="en-US" w:eastAsia="zh-CN"/>
+              </w:rPr>
+            </w:pPr>
+            <w:r>
+              <w:rPr>
+                <w:rFonts w:hint="eastAsia" w:ascii="宋体" w:hAnsi="宋体" w:eastAsia="宋体" w:cs="宋体"/>
+                <w:color w:val="000000"/>
+                <w:sz w:val="18"/>
+                <w:szCs w:val="18"/>
+                <w:lang w:val="en-US" w:eastAsia="zh-CN"/>
+              </w:rPr>
+              <w:t xml:space="preserve">516,000</w:t>
             </w:r>
           </w:p>
         </w:tc>
@@ -10104,7 +9388,7 @@
         </w:trPr>
         <w:tc>
           <w:tcPr>
-            <w:tcW w:w="672" w:type="dxa"/>
+            <w:tcW w:w="3322" w:type="dxa"/>
             <w:tcMar>
               <w:top w:w="100" w:type="dxa"/>
               <w:left w:w="60" w:type="dxa"/>
@@ -10133,929 +9417,42 @@
                 <w:szCs w:val="18"/>
                 <w:lang w:val="en-US" w:eastAsia="zh-CN"/>
               </w:rPr>
-              <w:t xml:space="preserve">门禁与显示设备</w:t>
-            </w:r>
-          </w:p>
-        </w:tc>
-        <w:tc>
-          <w:tcPr>
-            <w:tcW w:w="480" w:type="dxa"/>
-            <w:tcMar>
-              <w:top w:w="100" w:type="dxa"/>
-              <w:left w:w="60" w:type="dxa"/>
-              <w:bottom w:w="100" w:type="dxa"/>
-              <w:right w:w="60" w:type="dxa"/>
-            </w:tcMar>
-            <w:vAlign w:val="center"/>
-          </w:tcPr>
-          <w:p>
-            <w:pPr>
-              <w:spacing w:before="0" w:after="0" w:line="269" w:lineRule="auto"/>
-              <w:jc w:val="left"/>
-              <w:rPr>
-                <w:rFonts w:hint="eastAsia" w:ascii="宋体" w:hAnsi="宋体" w:eastAsia="宋体" w:cs="宋体"/>
-                <w:color w:val="000000"/>
-                <w:sz w:val="18"/>
-                <w:szCs w:val="18"/>
-                <w:lang w:val="en-US" w:eastAsia="zh-CN"/>
-              </w:rPr>
-            </w:pPr>
-            <w:r>
-              <w:rPr>
-                <w:rFonts w:hint="eastAsia" w:ascii="宋体" w:hAnsi="宋体" w:eastAsia="宋体" w:cs="宋体"/>
-                <w:color w:val="000000"/>
-                <w:sz w:val="18"/>
-                <w:szCs w:val="18"/>
-                <w:lang w:val="en-US" w:eastAsia="zh-CN"/>
-              </w:rPr>
-              <w:t xml:space="preserve">3</w:t>
-            </w:r>
-          </w:p>
-        </w:tc>
-        <w:tc>
-          <w:tcPr>
-            <w:tcW w:w="912" w:type="dxa"/>
-            <w:tcMar>
-              <w:top w:w="100" w:type="dxa"/>
-              <w:left w:w="60" w:type="dxa"/>
-              <w:bottom w:w="100" w:type="dxa"/>
-              <w:right w:w="60" w:type="dxa"/>
-            </w:tcMar>
-            <w:vAlign w:val="center"/>
-          </w:tcPr>
-          <w:p>
-            <w:pPr>
-              <w:spacing w:before="0" w:after="0" w:line="269" w:lineRule="auto"/>
-              <w:jc w:val="left"/>
-              <w:rPr>
-                <w:rFonts w:hint="eastAsia" w:ascii="宋体" w:hAnsi="宋体" w:eastAsia="宋体" w:cs="宋体"/>
-                <w:color w:val="000000"/>
-                <w:sz w:val="18"/>
-                <w:szCs w:val="18"/>
-                <w:lang w:val="en-US" w:eastAsia="zh-CN"/>
-              </w:rPr>
-            </w:pPr>
-            <w:r>
-              <w:rPr>
-                <w:rFonts w:hint="eastAsia" w:ascii="宋体" w:hAnsi="宋体" w:eastAsia="宋体" w:cs="宋体"/>
-                <w:color w:val="000000"/>
-                <w:sz w:val="18"/>
-                <w:szCs w:val="18"/>
-                <w:lang w:val="en-US" w:eastAsia="zh-CN"/>
-              </w:rPr>
-              <w:t xml:space="preserve">委托前台引导屏</w:t>
-            </w:r>
-          </w:p>
-        </w:tc>
-        <w:tc>
-          <w:tcPr>
-            <w:tcW w:w="2400" w:type="dxa"/>
-            <w:tcMar>
-              <w:top w:w="100" w:type="dxa"/>
-              <w:left w:w="60" w:type="dxa"/>
-              <w:bottom w:w="100" w:type="dxa"/>
-              <w:right w:w="60" w:type="dxa"/>
-            </w:tcMar>
-            <w:vAlign w:val="center"/>
-          </w:tcPr>
-          <w:p>
-            <w:pPr>
-              <w:spacing w:before="0" w:after="0" w:line="269" w:lineRule="auto"/>
-              <w:jc w:val="left"/>
-              <w:rPr>
-                <w:rFonts w:hint="eastAsia" w:ascii="宋体" w:hAnsi="宋体" w:eastAsia="宋体" w:cs="宋体"/>
-                <w:color w:val="000000"/>
-                <w:sz w:val="18"/>
-                <w:szCs w:val="18"/>
-                <w:lang w:val="en-US" w:eastAsia="zh-CN"/>
-              </w:rPr>
-            </w:pPr>
-            <w:r>
-              <w:rPr>
-                <w:rFonts w:hint="eastAsia" w:ascii="宋体" w:hAnsi="宋体" w:eastAsia="宋体" w:cs="宋体"/>
-                <w:color w:val="000000"/>
-                <w:sz w:val="18"/>
-                <w:szCs w:val="18"/>
-                <w:lang w:val="en-US" w:eastAsia="zh-CN"/>
-              </w:rPr>
-              <w:t xml:space="preserve">55英寸商用显示屏，用于滚动展示当日及次日试验任务</w:t>
-            </w:r>
-          </w:p>
-        </w:tc>
-        <w:tc>
-          <w:tcPr>
-            <w:tcW w:w="432" w:type="dxa"/>
-            <w:tcMar>
-              <w:top w:w="100" w:type="dxa"/>
-              <w:left w:w="60" w:type="dxa"/>
-              <w:bottom w:w="100" w:type="dxa"/>
-              <w:right w:w="60" w:type="dxa"/>
-            </w:tcMar>
-            <w:vAlign w:val="center"/>
-          </w:tcPr>
-          <w:p>
-            <w:pPr>
-              <w:spacing w:before="0" w:after="0" w:line="269" w:lineRule="auto"/>
-              <w:jc w:val="left"/>
-              <w:rPr>
-                <w:rFonts w:hint="eastAsia" w:ascii="宋体" w:hAnsi="宋体" w:eastAsia="宋体" w:cs="宋体"/>
-                <w:color w:val="000000"/>
-                <w:sz w:val="18"/>
-                <w:szCs w:val="18"/>
-                <w:lang w:val="en-US" w:eastAsia="zh-CN"/>
-              </w:rPr>
-            </w:pPr>
-            <w:r>
-              <w:rPr>
-                <w:rFonts w:hint="eastAsia" w:ascii="宋体" w:hAnsi="宋体" w:eastAsia="宋体" w:cs="宋体"/>
-                <w:color w:val="000000"/>
-                <w:sz w:val="18"/>
-                <w:szCs w:val="18"/>
-                <w:lang w:val="en-US" w:eastAsia="zh-CN"/>
-              </w:rPr>
-              <w:t xml:space="preserve">台</w:t>
-            </w:r>
-          </w:p>
-        </w:tc>
-        <w:tc>
-          <w:tcPr>
-            <w:tcW w:w="528" w:type="dxa"/>
-            <w:tcMar>
-              <w:top w:w="100" w:type="dxa"/>
-              <w:left w:w="60" w:type="dxa"/>
-              <w:bottom w:w="100" w:type="dxa"/>
-              <w:right w:w="60" w:type="dxa"/>
-            </w:tcMar>
-            <w:vAlign w:val="center"/>
-          </w:tcPr>
-          <w:p>
-            <w:pPr>
-              <w:spacing w:before="0" w:after="0" w:line="269" w:lineRule="auto"/>
-              <w:jc w:val="left"/>
-              <w:rPr>
-                <w:rFonts w:hint="eastAsia" w:ascii="宋体" w:hAnsi="宋体" w:eastAsia="宋体" w:cs="宋体"/>
-                <w:color w:val="000000"/>
-                <w:sz w:val="18"/>
-                <w:szCs w:val="18"/>
-                <w:lang w:val="en-US" w:eastAsia="zh-CN"/>
-              </w:rPr>
-            </w:pPr>
-            <w:r>
-              <w:rPr>
-                <w:rFonts w:hint="eastAsia" w:ascii="宋体" w:hAnsi="宋体" w:eastAsia="宋体" w:cs="宋体"/>
-                <w:color w:val="000000"/>
-                <w:sz w:val="18"/>
-                <w:szCs w:val="18"/>
-                <w:lang w:val="en-US" w:eastAsia="zh-CN"/>
-              </w:rPr>
-              <w:t xml:space="preserve">1</w:t>
-            </w:r>
-          </w:p>
-        </w:tc>
-        <w:tc>
-          <w:tcPr>
-            <w:tcW w:w="960" w:type="dxa"/>
-            <w:tcMar>
-              <w:top w:w="100" w:type="dxa"/>
-              <w:left w:w="60" w:type="dxa"/>
-              <w:bottom w:w="100" w:type="dxa"/>
-              <w:right w:w="60" w:type="dxa"/>
-            </w:tcMar>
-            <w:vAlign w:val="center"/>
-          </w:tcPr>
-          <w:p>
-            <w:pPr>
-              <w:spacing w:before="0" w:after="0" w:line="269" w:lineRule="auto"/>
-              <w:jc w:val="left"/>
-              <w:rPr>
-                <w:rFonts w:hint="eastAsia" w:ascii="宋体" w:hAnsi="宋体" w:eastAsia="宋体" w:cs="宋体"/>
-                <w:color w:val="000000"/>
-                <w:sz w:val="18"/>
-                <w:szCs w:val="18"/>
-                <w:lang w:val="en-US" w:eastAsia="zh-CN"/>
-              </w:rPr>
-            </w:pPr>
-            <w:r>
-              <w:rPr>
-                <w:rFonts w:hint="eastAsia" w:ascii="宋体" w:hAnsi="宋体" w:eastAsia="宋体" w:cs="宋体"/>
-                <w:color w:val="000000"/>
-                <w:sz w:val="18"/>
-                <w:szCs w:val="18"/>
-                <w:lang w:val="en-US" w:eastAsia="zh-CN"/>
-              </w:rPr>
-              <w:t xml:space="preserve">8,000</w:t>
-            </w:r>
-          </w:p>
-        </w:tc>
-        <w:tc>
-          <w:tcPr>
-            <w:tcW w:w="1008" w:type="dxa"/>
-            <w:tcMar>
-              <w:top w:w="100" w:type="dxa"/>
-              <w:left w:w="60" w:type="dxa"/>
-              <w:bottom w:w="100" w:type="dxa"/>
-              <w:right w:w="60" w:type="dxa"/>
-            </w:tcMar>
-            <w:vAlign w:val="center"/>
-          </w:tcPr>
-          <w:p>
-            <w:pPr>
-              <w:spacing w:before="0" w:after="0" w:line="269" w:lineRule="auto"/>
-              <w:jc w:val="left"/>
-              <w:rPr>
-                <w:rFonts w:hint="eastAsia" w:ascii="宋体" w:hAnsi="宋体" w:eastAsia="宋体" w:cs="宋体"/>
-                <w:color w:val="000000"/>
-                <w:sz w:val="18"/>
-                <w:szCs w:val="18"/>
-                <w:lang w:val="en-US" w:eastAsia="zh-CN"/>
-              </w:rPr>
-            </w:pPr>
-            <w:r>
-              <w:rPr>
-                <w:rFonts w:hint="eastAsia" w:ascii="宋体" w:hAnsi="宋体" w:eastAsia="宋体" w:cs="宋体"/>
-                <w:color w:val="000000"/>
-                <w:sz w:val="18"/>
-                <w:szCs w:val="18"/>
-                <w:lang w:val="en-US" w:eastAsia="zh-CN"/>
-              </w:rPr>
-              <w:t xml:space="preserve">8,000</w:t>
-            </w:r>
-          </w:p>
-        </w:tc>
-        <w:tc>
-          <w:tcPr>
-            <w:tcW w:w="914" w:type="dxa"/>
-            <w:tcMar>
-              <w:top w:w="100" w:type="dxa"/>
-              <w:left w:w="60" w:type="dxa"/>
-              <w:bottom w:w="100" w:type="dxa"/>
-              <w:right w:w="60" w:type="dxa"/>
-            </w:tcMar>
-            <w:vAlign w:val="center"/>
-          </w:tcPr>
-          <w:p>
-            <w:pPr>
-              <w:spacing w:before="0" w:after="0" w:line="269" w:lineRule="auto"/>
-              <w:jc w:val="left"/>
-              <w:rPr>
-                <w:rFonts w:hint="eastAsia" w:ascii="宋体" w:hAnsi="宋体" w:eastAsia="宋体" w:cs="宋体"/>
-                <w:color w:val="000000"/>
-                <w:sz w:val="18"/>
-                <w:szCs w:val="18"/>
-                <w:lang w:val="en-US" w:eastAsia="zh-CN"/>
-              </w:rPr>
-            </w:pPr>
-            <w:r>
-              <w:rPr>
-                <w:rFonts w:hint="eastAsia" w:ascii="宋体" w:hAnsi="宋体" w:eastAsia="宋体" w:cs="宋体"/>
-                <w:color w:val="000000"/>
-                <w:sz w:val="18"/>
-                <w:szCs w:val="18"/>
-                <w:lang w:val="en-US" w:eastAsia="zh-CN"/>
-              </w:rPr>
-              <w:t xml:space="preserve">含支架与安装</w:t>
-            </w:r>
-          </w:p>
-        </w:tc>
-      </w:tr>
-      <w:tr>
-        <w:trPr>
-          <w:cantSplit/>
-          <w:jc w:val="center"/>
-        </w:trPr>
-        <w:tc>
-          <w:tcPr>
-            <w:tcW w:w="672" w:type="dxa"/>
-            <w:tcMar>
-              <w:top w:w="100" w:type="dxa"/>
-              <w:left w:w="60" w:type="dxa"/>
-              <w:bottom w:w="100" w:type="dxa"/>
-              <w:right w:w="60" w:type="dxa"/>
-            </w:tcMar>
-            <w:vAlign w:val="center"/>
-          </w:tcPr>
-          <w:p>
-            <w:pPr>
-              <w:spacing w:before="0" w:after="0" w:line="269" w:lineRule="auto"/>
-              <w:jc w:val="center"/>
-              <w:rPr>
-                <w:rFonts w:hint="eastAsia" w:ascii="宋体" w:hAnsi="宋体" w:eastAsia="宋体" w:cs="宋体"/>
-                <w:color w:val="000000"/>
-                <w:sz w:val="18"/>
-                <w:szCs w:val="18"/>
-                <w:lang w:val="en-US" w:eastAsia="zh-CN"/>
-              </w:rPr>
-            </w:pPr>
-            <w:r>
-              <w:rPr>
-                <w:rFonts w:hint="eastAsia" w:ascii="宋体" w:hAnsi="宋体" w:eastAsia="宋体" w:cs="宋体"/>
-                <w:color w:val="000000"/>
-                <w:sz w:val="18"/>
-                <w:szCs w:val="18"/>
-                <w:lang w:val="en-US" w:eastAsia="zh-CN"/>
-              </w:rPr>
-              <w:t xml:space="preserve">数据采集设备</w:t>
-            </w:r>
-          </w:p>
-        </w:tc>
-        <w:tc>
-          <w:tcPr>
-            <w:tcW w:w="480" w:type="dxa"/>
-            <w:tcMar>
-              <w:top w:w="100" w:type="dxa"/>
-              <w:left w:w="60" w:type="dxa"/>
-              <w:bottom w:w="100" w:type="dxa"/>
-              <w:right w:w="60" w:type="dxa"/>
-            </w:tcMar>
-            <w:vAlign w:val="center"/>
-          </w:tcPr>
-          <w:p>
-            <w:pPr>
-              <w:spacing w:before="0" w:after="0" w:line="269" w:lineRule="auto"/>
-              <w:jc w:val="left"/>
-              <w:rPr>
-                <w:rFonts w:hint="eastAsia" w:ascii="宋体" w:hAnsi="宋体" w:eastAsia="宋体" w:cs="宋体"/>
-                <w:color w:val="000000"/>
-                <w:sz w:val="18"/>
-                <w:szCs w:val="18"/>
-                <w:lang w:val="en-US" w:eastAsia="zh-CN"/>
-              </w:rPr>
-            </w:pPr>
-            <w:r>
-              <w:rPr>
-                <w:rFonts w:hint="eastAsia" w:ascii="宋体" w:hAnsi="宋体" w:eastAsia="宋体" w:cs="宋体"/>
-                <w:color w:val="000000"/>
-                <w:sz w:val="18"/>
-                <w:szCs w:val="18"/>
-                <w:lang w:val="en-US" w:eastAsia="zh-CN"/>
-              </w:rPr>
-              <w:t xml:space="preserve">4</w:t>
-            </w:r>
-          </w:p>
-        </w:tc>
-        <w:tc>
-          <w:tcPr>
-            <w:tcW w:w="912" w:type="dxa"/>
-            <w:tcMar>
-              <w:top w:w="100" w:type="dxa"/>
-              <w:left w:w="60" w:type="dxa"/>
-              <w:bottom w:w="100" w:type="dxa"/>
-              <w:right w:w="60" w:type="dxa"/>
-            </w:tcMar>
-            <w:vAlign w:val="center"/>
-          </w:tcPr>
-          <w:p>
-            <w:pPr>
-              <w:spacing w:before="0" w:after="0" w:line="269" w:lineRule="auto"/>
-              <w:jc w:val="left"/>
-              <w:rPr>
-                <w:rFonts w:hint="eastAsia" w:ascii="宋体" w:hAnsi="宋体" w:eastAsia="宋体" w:cs="宋体"/>
-                <w:color w:val="000000"/>
-                <w:sz w:val="18"/>
-                <w:szCs w:val="18"/>
-                <w:lang w:val="en-US" w:eastAsia="zh-CN"/>
-              </w:rPr>
-            </w:pPr>
-            <w:r>
-              <w:rPr>
-                <w:rFonts w:hint="eastAsia" w:ascii="宋体" w:hAnsi="宋体" w:eastAsia="宋体" w:cs="宋体"/>
-                <w:color w:val="000000"/>
-                <w:sz w:val="18"/>
-                <w:szCs w:val="18"/>
-                <w:lang w:val="en-US" w:eastAsia="zh-CN"/>
-              </w:rPr>
-              <w:t xml:space="preserve">边缘采集网关</w:t>
-            </w:r>
-          </w:p>
-        </w:tc>
-        <w:tc>
-          <w:tcPr>
-            <w:tcW w:w="2400" w:type="dxa"/>
-            <w:tcMar>
-              <w:top w:w="100" w:type="dxa"/>
-              <w:left w:w="60" w:type="dxa"/>
-              <w:bottom w:w="100" w:type="dxa"/>
-              <w:right w:w="60" w:type="dxa"/>
-            </w:tcMar>
-            <w:vAlign w:val="center"/>
-          </w:tcPr>
-          <w:p>
-            <w:pPr>
-              <w:spacing w:before="0" w:after="0" w:line="269" w:lineRule="auto"/>
-              <w:jc w:val="left"/>
-              <w:rPr>
-                <w:rFonts w:hint="eastAsia" w:ascii="宋体" w:hAnsi="宋体" w:eastAsia="宋体" w:cs="宋体"/>
-                <w:color w:val="000000"/>
-                <w:sz w:val="18"/>
-                <w:szCs w:val="18"/>
-                <w:lang w:val="en-US" w:eastAsia="zh-CN"/>
-              </w:rPr>
-            </w:pPr>
-            <w:r>
-              <w:rPr>
-                <w:rFonts w:hint="eastAsia" w:ascii="宋体" w:hAnsi="宋体" w:eastAsia="宋体" w:cs="宋体"/>
-                <w:color w:val="000000"/>
-                <w:sz w:val="18"/>
-                <w:szCs w:val="18"/>
-                <w:lang w:val="en-US" w:eastAsia="zh-CN"/>
-              </w:rPr>
-              <w:t xml:space="preserve">支持RS232/RS485串口与以太网接口，用于采集试验设备通信数据</w:t>
-            </w:r>
-          </w:p>
-        </w:tc>
-        <w:tc>
-          <w:tcPr>
-            <w:tcW w:w="432" w:type="dxa"/>
-            <w:tcMar>
-              <w:top w:w="100" w:type="dxa"/>
-              <w:left w:w="60" w:type="dxa"/>
-              <w:bottom w:w="100" w:type="dxa"/>
-              <w:right w:w="60" w:type="dxa"/>
-            </w:tcMar>
-            <w:vAlign w:val="center"/>
-          </w:tcPr>
-          <w:p>
-            <w:pPr>
-              <w:spacing w:before="0" w:after="0" w:line="269" w:lineRule="auto"/>
-              <w:jc w:val="left"/>
-              <w:rPr>
-                <w:rFonts w:hint="eastAsia" w:ascii="宋体" w:hAnsi="宋体" w:eastAsia="宋体" w:cs="宋体"/>
-                <w:color w:val="000000"/>
-                <w:sz w:val="18"/>
-                <w:szCs w:val="18"/>
-                <w:lang w:val="en-US" w:eastAsia="zh-CN"/>
-              </w:rPr>
-            </w:pPr>
-            <w:r>
-              <w:rPr>
-                <w:rFonts w:hint="eastAsia" w:ascii="宋体" w:hAnsi="宋体" w:eastAsia="宋体" w:cs="宋体"/>
-                <w:color w:val="000000"/>
-                <w:sz w:val="18"/>
-                <w:szCs w:val="18"/>
-                <w:lang w:val="en-US" w:eastAsia="zh-CN"/>
-              </w:rPr>
-              <w:t xml:space="preserve">台</w:t>
-            </w:r>
-          </w:p>
-        </w:tc>
-        <w:tc>
-          <w:tcPr>
-            <w:tcW w:w="528" w:type="dxa"/>
-            <w:tcMar>
-              <w:top w:w="100" w:type="dxa"/>
-              <w:left w:w="60" w:type="dxa"/>
-              <w:bottom w:w="100" w:type="dxa"/>
-              <w:right w:w="60" w:type="dxa"/>
-            </w:tcMar>
-            <w:vAlign w:val="center"/>
-          </w:tcPr>
-          <w:p>
-            <w:pPr>
-              <w:spacing w:before="0" w:after="0" w:line="269" w:lineRule="auto"/>
-              <w:jc w:val="left"/>
-              <w:rPr>
-                <w:rFonts w:hint="eastAsia" w:ascii="宋体" w:hAnsi="宋体" w:eastAsia="宋体" w:cs="宋体"/>
-                <w:color w:val="000000"/>
-                <w:sz w:val="18"/>
-                <w:szCs w:val="18"/>
-                <w:lang w:val="en-US" w:eastAsia="zh-CN"/>
-              </w:rPr>
-            </w:pPr>
-            <w:r>
-              <w:rPr>
-                <w:rFonts w:hint="eastAsia" w:ascii="宋体" w:hAnsi="宋体" w:eastAsia="宋体" w:cs="宋体"/>
-                <w:color w:val="000000"/>
-                <w:sz w:val="18"/>
-                <w:szCs w:val="18"/>
-                <w:lang w:val="en-US" w:eastAsia="zh-CN"/>
-              </w:rPr>
-              <w:t xml:space="preserve">4</w:t>
-            </w:r>
-          </w:p>
-        </w:tc>
-        <w:tc>
-          <w:tcPr>
-            <w:tcW w:w="960" w:type="dxa"/>
-            <w:tcMar>
-              <w:top w:w="100" w:type="dxa"/>
-              <w:left w:w="60" w:type="dxa"/>
-              <w:bottom w:w="100" w:type="dxa"/>
-              <w:right w:w="60" w:type="dxa"/>
-            </w:tcMar>
-            <w:vAlign w:val="center"/>
-          </w:tcPr>
-          <w:p>
-            <w:pPr>
-              <w:spacing w:before="0" w:after="0" w:line="269" w:lineRule="auto"/>
-              <w:jc w:val="left"/>
-              <w:rPr>
-                <w:rFonts w:hint="eastAsia" w:ascii="宋体" w:hAnsi="宋体" w:eastAsia="宋体" w:cs="宋体"/>
-                <w:color w:val="000000"/>
-                <w:sz w:val="18"/>
-                <w:szCs w:val="18"/>
-                <w:lang w:val="en-US" w:eastAsia="zh-CN"/>
-              </w:rPr>
-            </w:pPr>
-            <w:r>
-              <w:rPr>
-                <w:rFonts w:hint="eastAsia" w:ascii="宋体" w:hAnsi="宋体" w:eastAsia="宋体" w:cs="宋体"/>
-                <w:color w:val="000000"/>
-                <w:sz w:val="18"/>
-                <w:szCs w:val="18"/>
-                <w:lang w:val="en-US" w:eastAsia="zh-CN"/>
-              </w:rPr>
-              <w:t xml:space="preserve">3,000</w:t>
-            </w:r>
-          </w:p>
-        </w:tc>
-        <w:tc>
-          <w:tcPr>
-            <w:tcW w:w="1008" w:type="dxa"/>
-            <w:tcMar>
-              <w:top w:w="100" w:type="dxa"/>
-              <w:left w:w="60" w:type="dxa"/>
-              <w:bottom w:w="100" w:type="dxa"/>
-              <w:right w:w="60" w:type="dxa"/>
-            </w:tcMar>
-            <w:vAlign w:val="center"/>
-          </w:tcPr>
-          <w:p>
-            <w:pPr>
-              <w:spacing w:before="0" w:after="0" w:line="269" w:lineRule="auto"/>
-              <w:jc w:val="left"/>
-              <w:rPr>
-                <w:rFonts w:hint="eastAsia" w:ascii="宋体" w:hAnsi="宋体" w:eastAsia="宋体" w:cs="宋体"/>
-                <w:color w:val="000000"/>
-                <w:sz w:val="18"/>
-                <w:szCs w:val="18"/>
-                <w:lang w:val="en-US" w:eastAsia="zh-CN"/>
-              </w:rPr>
-            </w:pPr>
-            <w:r>
-              <w:rPr>
-                <w:rFonts w:hint="eastAsia" w:ascii="宋体" w:hAnsi="宋体" w:eastAsia="宋体" w:cs="宋体"/>
-                <w:color w:val="000000"/>
-                <w:sz w:val="18"/>
-                <w:szCs w:val="18"/>
-                <w:lang w:val="en-US" w:eastAsia="zh-CN"/>
-              </w:rPr>
-              <w:t xml:space="preserve">12,000</w:t>
-            </w:r>
-          </w:p>
-        </w:tc>
-        <w:tc>
-          <w:tcPr>
-            <w:tcW w:w="914" w:type="dxa"/>
-            <w:tcMar>
-              <w:top w:w="100" w:type="dxa"/>
-              <w:left w:w="60" w:type="dxa"/>
-              <w:bottom w:w="100" w:type="dxa"/>
-              <w:right w:w="60" w:type="dxa"/>
-            </w:tcMar>
-            <w:vAlign w:val="center"/>
-          </w:tcPr>
-          <w:p>
-            <w:pPr>
-              <w:spacing w:before="0" w:after="0" w:line="269" w:lineRule="auto"/>
-              <w:jc w:val="left"/>
-              <w:rPr>
-                <w:rFonts w:hint="eastAsia" w:ascii="宋体" w:hAnsi="宋体" w:eastAsia="宋体" w:cs="宋体"/>
-                <w:color w:val="000000"/>
-                <w:sz w:val="18"/>
-                <w:szCs w:val="18"/>
-                <w:lang w:val="en-US" w:eastAsia="zh-CN"/>
-              </w:rPr>
-            </w:pPr>
-            <w:r>
-              <w:rPr>
-                <w:rFonts w:hint="eastAsia" w:ascii="宋体" w:hAnsi="宋体" w:eastAsia="宋体" w:cs="宋体"/>
-                <w:color w:val="000000"/>
-                <w:sz w:val="18"/>
-                <w:szCs w:val="18"/>
-                <w:lang w:val="en-US" w:eastAsia="zh-CN"/>
-              </w:rPr>
-              <w:t xml:space="preserve">数量以接入设备为准</w:t>
-            </w:r>
-          </w:p>
-        </w:tc>
-      </w:tr>
-      <w:tr>
-        <w:trPr>
-          <w:cantSplit/>
-          <w:jc w:val="center"/>
-        </w:trPr>
-        <w:tc>
-          <w:tcPr>
-            <w:tcW w:w="672" w:type="dxa"/>
-            <w:tcMar>
-              <w:top w:w="100" w:type="dxa"/>
-              <w:left w:w="60" w:type="dxa"/>
-              <w:bottom w:w="100" w:type="dxa"/>
-              <w:right w:w="60" w:type="dxa"/>
-            </w:tcMar>
-            <w:vAlign w:val="center"/>
-          </w:tcPr>
-          <w:p>
-            <w:pPr>
-              <w:spacing w:before="0" w:after="0" w:line="269" w:lineRule="auto"/>
-              <w:jc w:val="center"/>
-              <w:rPr>
-                <w:rFonts w:hint="eastAsia" w:ascii="宋体" w:hAnsi="宋体" w:eastAsia="宋体" w:cs="宋体"/>
-                <w:color w:val="000000"/>
-                <w:sz w:val="18"/>
-                <w:szCs w:val="18"/>
-                <w:lang w:val="en-US" w:eastAsia="zh-CN"/>
-              </w:rPr>
-            </w:pPr>
-            <w:r>
-              <w:rPr>
-                <w:rFonts w:hint="eastAsia" w:ascii="宋体" w:hAnsi="宋体" w:eastAsia="宋体" w:cs="宋体"/>
-                <w:color w:val="000000"/>
-                <w:sz w:val="18"/>
-                <w:szCs w:val="18"/>
-                <w:lang w:val="en-US" w:eastAsia="zh-CN"/>
-              </w:rPr>
-              <w:t xml:space="preserve">硬件小计</w:t>
-            </w:r>
-          </w:p>
-        </w:tc>
-        <w:tc>
-          <w:tcPr>
-            <w:tcW w:w="480" w:type="dxa"/>
-            <w:tcMar>
-              <w:top w:w="100" w:type="dxa"/>
-              <w:left w:w="60" w:type="dxa"/>
-              <w:bottom w:w="100" w:type="dxa"/>
-              <w:right w:w="60" w:type="dxa"/>
-            </w:tcMar>
-            <w:vAlign w:val="center"/>
-          </w:tcPr>
-          <w:p>
-            <w:pPr>
-              <w:spacing w:before="0" w:after="0" w:line="269" w:lineRule="auto"/>
-              <w:jc w:val="left"/>
-              <w:rPr>
-                <w:rFonts w:hint="eastAsia" w:ascii="宋体" w:hAnsi="宋体" w:eastAsia="宋体" w:cs="宋体"/>
-                <w:color w:val="000000"/>
-                <w:sz w:val="18"/>
-                <w:szCs w:val="18"/>
-                <w:lang w:val="en-US" w:eastAsia="zh-CN"/>
-              </w:rPr>
-            </w:pPr>
-            <w:r>
-              <w:rPr>
-                <w:rFonts w:hint="eastAsia" w:ascii="宋体" w:hAnsi="宋体" w:eastAsia="宋体" w:cs="宋体"/>
-                <w:color w:val="000000"/>
-                <w:sz w:val="18"/>
-                <w:szCs w:val="18"/>
-                <w:lang w:val="en-US" w:eastAsia="zh-CN"/>
-              </w:rPr>
-              <w:t xml:space="preserve"/>
-            </w:r>
-          </w:p>
-        </w:tc>
-        <w:tc>
-          <w:tcPr>
-            <w:tcW w:w="912" w:type="dxa"/>
-            <w:tcMar>
-              <w:top w:w="100" w:type="dxa"/>
-              <w:left w:w="60" w:type="dxa"/>
-              <w:bottom w:w="100" w:type="dxa"/>
-              <w:right w:w="60" w:type="dxa"/>
-            </w:tcMar>
-            <w:vAlign w:val="center"/>
-          </w:tcPr>
-          <w:p>
-            <w:pPr>
-              <w:spacing w:before="0" w:after="0" w:line="269" w:lineRule="auto"/>
-              <w:jc w:val="left"/>
-              <w:rPr>
-                <w:rFonts w:hint="eastAsia" w:ascii="宋体" w:hAnsi="宋体" w:eastAsia="宋体" w:cs="宋体"/>
-                <w:color w:val="000000"/>
-                <w:sz w:val="18"/>
-                <w:szCs w:val="18"/>
-                <w:lang w:val="en-US" w:eastAsia="zh-CN"/>
-              </w:rPr>
-            </w:pPr>
-            <w:r>
-              <w:rPr>
-                <w:rFonts w:hint="eastAsia" w:ascii="宋体" w:hAnsi="宋体" w:eastAsia="宋体" w:cs="宋体"/>
-                <w:color w:val="000000"/>
-                <w:sz w:val="18"/>
-                <w:szCs w:val="18"/>
-                <w:lang w:val="en-US" w:eastAsia="zh-CN"/>
-              </w:rPr>
-              <w:t xml:space="preserve"/>
-            </w:r>
-          </w:p>
-        </w:tc>
-        <w:tc>
-          <w:tcPr>
-            <w:tcW w:w="2400" w:type="dxa"/>
-            <w:tcMar>
-              <w:top w:w="100" w:type="dxa"/>
-              <w:left w:w="60" w:type="dxa"/>
-              <w:bottom w:w="100" w:type="dxa"/>
-              <w:right w:w="60" w:type="dxa"/>
-            </w:tcMar>
-            <w:vAlign w:val="center"/>
-          </w:tcPr>
-          <w:p>
-            <w:pPr>
-              <w:spacing w:before="0" w:after="0" w:line="269" w:lineRule="auto"/>
-              <w:jc w:val="left"/>
-              <w:rPr>
-                <w:rFonts w:hint="eastAsia" w:ascii="宋体" w:hAnsi="宋体" w:eastAsia="宋体" w:cs="宋体"/>
-                <w:color w:val="000000"/>
-                <w:sz w:val="18"/>
-                <w:szCs w:val="18"/>
-                <w:lang w:val="en-US" w:eastAsia="zh-CN"/>
-              </w:rPr>
-            </w:pPr>
-            <w:r>
-              <w:rPr>
-                <w:rFonts w:hint="eastAsia" w:ascii="宋体" w:hAnsi="宋体" w:eastAsia="宋体" w:cs="宋体"/>
-                <w:color w:val="000000"/>
-                <w:sz w:val="18"/>
-                <w:szCs w:val="18"/>
-                <w:lang w:val="en-US" w:eastAsia="zh-CN"/>
-              </w:rPr>
-              <w:t xml:space="preserve"/>
-            </w:r>
-          </w:p>
-        </w:tc>
-        <w:tc>
-          <w:tcPr>
-            <w:tcW w:w="432" w:type="dxa"/>
-            <w:tcMar>
-              <w:top w:w="100" w:type="dxa"/>
-              <w:left w:w="60" w:type="dxa"/>
-              <w:bottom w:w="100" w:type="dxa"/>
-              <w:right w:w="60" w:type="dxa"/>
-            </w:tcMar>
-            <w:vAlign w:val="center"/>
-          </w:tcPr>
-          <w:p>
-            <w:pPr>
-              <w:spacing w:before="0" w:after="0" w:line="269" w:lineRule="auto"/>
-              <w:jc w:val="left"/>
-              <w:rPr>
-                <w:rFonts w:hint="eastAsia" w:ascii="宋体" w:hAnsi="宋体" w:eastAsia="宋体" w:cs="宋体"/>
-                <w:color w:val="000000"/>
-                <w:sz w:val="18"/>
-                <w:szCs w:val="18"/>
-                <w:lang w:val="en-US" w:eastAsia="zh-CN"/>
-              </w:rPr>
-            </w:pPr>
-            <w:r>
-              <w:rPr>
-                <w:rFonts w:hint="eastAsia" w:ascii="宋体" w:hAnsi="宋体" w:eastAsia="宋体" w:cs="宋体"/>
-                <w:color w:val="000000"/>
-                <w:sz w:val="18"/>
-                <w:szCs w:val="18"/>
-                <w:lang w:val="en-US" w:eastAsia="zh-CN"/>
-              </w:rPr>
-              <w:t xml:space="preserve"/>
-            </w:r>
-          </w:p>
-        </w:tc>
-        <w:tc>
-          <w:tcPr>
-            <w:tcW w:w="528" w:type="dxa"/>
-            <w:tcMar>
-              <w:top w:w="100" w:type="dxa"/>
-              <w:left w:w="60" w:type="dxa"/>
-              <w:bottom w:w="100" w:type="dxa"/>
-              <w:right w:w="60" w:type="dxa"/>
-            </w:tcMar>
-            <w:vAlign w:val="center"/>
-          </w:tcPr>
-          <w:p>
-            <w:pPr>
-              <w:spacing w:before="0" w:after="0" w:line="269" w:lineRule="auto"/>
-              <w:jc w:val="left"/>
-              <w:rPr>
-                <w:rFonts w:hint="eastAsia" w:ascii="宋体" w:hAnsi="宋体" w:eastAsia="宋体" w:cs="宋体"/>
-                <w:color w:val="000000"/>
-                <w:sz w:val="18"/>
-                <w:szCs w:val="18"/>
-                <w:lang w:val="en-US" w:eastAsia="zh-CN"/>
-              </w:rPr>
-            </w:pPr>
-            <w:r>
-              <w:rPr>
-                <w:rFonts w:hint="eastAsia" w:ascii="宋体" w:hAnsi="宋体" w:eastAsia="宋体" w:cs="宋体"/>
-                <w:color w:val="000000"/>
-                <w:sz w:val="18"/>
-                <w:szCs w:val="18"/>
-                <w:lang w:val="en-US" w:eastAsia="zh-CN"/>
-              </w:rPr>
-              <w:t xml:space="preserve"/>
-            </w:r>
-          </w:p>
-        </w:tc>
-        <w:tc>
-          <w:tcPr>
-            <w:tcW w:w="960" w:type="dxa"/>
-            <w:tcMar>
-              <w:top w:w="100" w:type="dxa"/>
-              <w:left w:w="60" w:type="dxa"/>
-              <w:bottom w:w="100" w:type="dxa"/>
-              <w:right w:w="60" w:type="dxa"/>
-            </w:tcMar>
-            <w:vAlign w:val="center"/>
-          </w:tcPr>
-          <w:p>
-            <w:pPr>
-              <w:spacing w:before="0" w:after="0" w:line="269" w:lineRule="auto"/>
-              <w:jc w:val="left"/>
-              <w:rPr>
-                <w:rFonts w:hint="eastAsia" w:ascii="宋体" w:hAnsi="宋体" w:eastAsia="宋体" w:cs="宋体"/>
-                <w:color w:val="000000"/>
-                <w:sz w:val="18"/>
-                <w:szCs w:val="18"/>
-                <w:lang w:val="en-US" w:eastAsia="zh-CN"/>
-              </w:rPr>
-            </w:pPr>
-            <w:r>
-              <w:rPr>
-                <w:rFonts w:hint="eastAsia" w:ascii="宋体" w:hAnsi="宋体" w:eastAsia="宋体" w:cs="宋体"/>
-                <w:color w:val="000000"/>
-                <w:sz w:val="18"/>
-                <w:szCs w:val="18"/>
-                <w:lang w:val="en-US" w:eastAsia="zh-CN"/>
-              </w:rPr>
-              <w:t xml:space="preserve"/>
-            </w:r>
-          </w:p>
-        </w:tc>
-        <w:tc>
-          <w:tcPr>
-            <w:tcW w:w="1008" w:type="dxa"/>
-            <w:tcMar>
-              <w:top w:w="100" w:type="dxa"/>
-              <w:left w:w="60" w:type="dxa"/>
-              <w:bottom w:w="100" w:type="dxa"/>
-              <w:right w:w="60" w:type="dxa"/>
-            </w:tcMar>
-            <w:vAlign w:val="center"/>
-          </w:tcPr>
-          <w:p>
-            <w:pPr>
-              <w:spacing w:before="0" w:after="0" w:line="269" w:lineRule="auto"/>
-              <w:jc w:val="left"/>
-              <w:rPr>
-                <w:rFonts w:hint="eastAsia" w:ascii="宋体" w:hAnsi="宋体" w:eastAsia="宋体" w:cs="宋体"/>
-                <w:color w:val="000000"/>
-                <w:sz w:val="18"/>
-                <w:szCs w:val="18"/>
-                <w:lang w:val="en-US" w:eastAsia="zh-CN"/>
-              </w:rPr>
-            </w:pPr>
-            <w:r>
-              <w:rPr>
-                <w:rFonts w:hint="eastAsia" w:ascii="宋体" w:hAnsi="宋体" w:eastAsia="宋体" w:cs="宋体"/>
-                <w:color w:val="000000"/>
-                <w:sz w:val="18"/>
-                <w:szCs w:val="18"/>
-                <w:lang w:val="en-US" w:eastAsia="zh-CN"/>
-              </w:rPr>
-              <w:t xml:space="preserve">244,000</w:t>
-            </w:r>
-          </w:p>
-        </w:tc>
-        <w:tc>
-          <w:tcPr>
-            <w:tcW w:w="914" w:type="dxa"/>
-            <w:tcMar>
-              <w:top w:w="100" w:type="dxa"/>
-              <w:left w:w="60" w:type="dxa"/>
-              <w:bottom w:w="100" w:type="dxa"/>
-              <w:right w:w="60" w:type="dxa"/>
-            </w:tcMar>
-            <w:vAlign w:val="center"/>
-          </w:tcPr>
-          <w:p>
-            <w:pPr>
-              <w:spacing w:before="0" w:after="0" w:line="269" w:lineRule="auto"/>
-              <w:jc w:val="left"/>
-              <w:rPr>
-                <w:rFonts w:hint="eastAsia" w:ascii="宋体" w:hAnsi="宋体" w:eastAsia="宋体" w:cs="宋体"/>
-                <w:color w:val="000000"/>
-                <w:sz w:val="18"/>
-                <w:szCs w:val="18"/>
-                <w:lang w:val="en-US" w:eastAsia="zh-CN"/>
-              </w:rPr>
-            </w:pPr>
-            <w:r>
-              <w:rPr>
-                <w:rFonts w:hint="eastAsia" w:ascii="宋体" w:hAnsi="宋体" w:eastAsia="宋体" w:cs="宋体"/>
-                <w:color w:val="000000"/>
-                <w:sz w:val="18"/>
-                <w:szCs w:val="18"/>
-                <w:lang w:val="en-US" w:eastAsia="zh-CN"/>
-              </w:rPr>
-              <w:t xml:space="preserve"/>
+              <w:t xml:space="preserve">合计</w:t>
+            </w:r>
+          </w:p>
+        </w:tc>
+        <w:tc>
+          <w:tcPr>
+            <w:tcW w:w="4984" w:type="dxa"/>
+            <w:tcMar>
+              <w:top w:w="100" w:type="dxa"/>
+              <w:left w:w="60" w:type="dxa"/>
+              <w:bottom w:w="100" w:type="dxa"/>
+              <w:right w:w="60" w:type="dxa"/>
+            </w:tcMar>
+            <w:vAlign w:val="center"/>
+          </w:tcPr>
+          <w:p>
+            <w:pPr>
+              <w:spacing w:before="0" w:after="0" w:line="269" w:lineRule="auto"/>
+              <w:jc w:val="left"/>
+              <w:rPr>
+                <w:rFonts w:hint="eastAsia" w:ascii="宋体" w:hAnsi="宋体" w:eastAsia="宋体" w:cs="宋体"/>
+                <w:color w:val="000000"/>
+                <w:sz w:val="18"/>
+                <w:szCs w:val="18"/>
+                <w:lang w:val="en-US" w:eastAsia="zh-CN"/>
+              </w:rPr>
+            </w:pPr>
+            <w:r>
+              <w:rPr>
+                <w:rFonts w:hint="eastAsia" w:ascii="宋体" w:hAnsi="宋体" w:eastAsia="宋体" w:cs="宋体"/>
+                <w:color w:val="000000"/>
+                <w:sz w:val="18"/>
+                <w:szCs w:val="18"/>
+                <w:lang w:val="en-US" w:eastAsia="zh-CN"/>
+              </w:rPr>
+              <w:t xml:space="preserve">800,000</w:t>
             </w:r>
           </w:p>
         </w:tc>
@@ -11110,7 +9507,7 @@
           <w:szCs w:val="28"/>
           <w:lang w:val="en-US" w:eastAsia="zh-CN" w:bidi="ar-SA"/>
         </w:rPr>
-        <w:t>5.2 软件报价清单</w:t>
+        <w:t>5.2 硬件报价清单</w:t>
       </w:r>
       <w:bookmarkEnd w:id="126"/>
     </w:p>
@@ -11531,7 +9928,7 @@
                 <w:szCs w:val="18"/>
                 <w:lang w:val="en-US" w:eastAsia="zh-CN"/>
               </w:rPr>
-              <w:t xml:space="preserve">委托受理</w:t>
+              <w:t xml:space="preserve">样品运输设备</w:t>
             </w:r>
           </w:p>
         </w:tc>
@@ -11601,7 +9998,7 @@
                 <w:szCs w:val="18"/>
                 <w:lang w:val="en-US" w:eastAsia="zh-CN"/>
               </w:rPr>
-              <w:t xml:space="preserve">扫码预委托小程序</w:t>
+              <w:t xml:space="preserve">样品运输机器人</w:t>
             </w:r>
           </w:p>
         </w:tc>
@@ -11636,7 +10033,7 @@
                 <w:szCs w:val="18"/>
                 <w:lang w:val="en-US" w:eastAsia="zh-CN"/>
               </w:rPr>
-              <w:t xml:space="preserve">小程序端委托填报，支持历史信息自动带出、纸质委托单拍照上传与委托记录查询</w:t>
+              <w:t xml:space="preserve">X300B工业搬运机器人，双轮差速驱动，激光SLAM导航，举升高度60 mm，导航到点精度&lt;±20 mm；含电池、自动回充桩、调度管理系统授权及现场建图调试</w:t>
             </w:r>
           </w:p>
         </w:tc>
@@ -11671,7 +10068,7 @@
                 <w:szCs w:val="18"/>
                 <w:lang w:val="en-US" w:eastAsia="zh-CN"/>
               </w:rPr>
-              <w:t xml:space="preserve">项</w:t>
+              <w:t xml:space="preserve">台</w:t>
             </w:r>
           </w:p>
         </w:tc>
@@ -11706,7 +10103,7 @@
                 <w:szCs w:val="18"/>
                 <w:lang w:val="en-US" w:eastAsia="zh-CN"/>
               </w:rPr>
-              <w:t xml:space="preserve">1</w:t>
+              <w:t xml:space="preserve">2</w:t>
             </w:r>
           </w:p>
         </w:tc>
@@ -11741,7 +10138,7 @@
                 <w:szCs w:val="18"/>
                 <w:lang w:val="en-US" w:eastAsia="zh-CN"/>
               </w:rPr>
-              <w:t xml:space="preserve">50,000</w:t>
+              <w:t xml:space="preserve">100,000</w:t>
             </w:r>
           </w:p>
         </w:tc>
@@ -11776,7 +10173,7 @@
                 <w:szCs w:val="18"/>
                 <w:lang w:val="en-US" w:eastAsia="zh-CN"/>
               </w:rPr>
-              <w:t xml:space="preserve">50,000</w:t>
+              <w:t xml:space="preserve">200,000</w:t>
             </w:r>
           </w:p>
         </w:tc>
@@ -11811,7 +10208,7 @@
                 <w:szCs w:val="18"/>
                 <w:lang w:val="en-US" w:eastAsia="zh-CN"/>
               </w:rPr>
-              <w:t xml:space="preserve"/>
+              <w:t xml:space="preserve">单台10万元</w:t>
             </w:r>
           </w:p>
         </w:tc>
@@ -11852,7 +10249,7 @@
                 <w:szCs w:val="18"/>
                 <w:lang w:val="en-US" w:eastAsia="zh-CN"/>
               </w:rPr>
-              <w:t xml:space="preserve">委托受理</w:t>
+              <w:t xml:space="preserve">门禁与显示设备</w:t>
             </w:r>
           </w:p>
         </w:tc>
@@ -11922,7 +10319,7 @@
                 <w:szCs w:val="18"/>
                 <w:lang w:val="en-US" w:eastAsia="zh-CN"/>
               </w:rPr>
-              <w:t xml:space="preserve">委托数据联动接口</w:t>
+              <w:t xml:space="preserve">运输机器人联动开门设备</w:t>
             </w:r>
           </w:p>
         </w:tc>
@@ -11957,7 +10354,7 @@
                 <w:szCs w:val="18"/>
                 <w:lang w:val="en-US" w:eastAsia="zh-CN"/>
               </w:rPr>
-              <w:t xml:space="preserve">与委托系统的数据同步，委托、样品、检测项目的结构化关联</w:t>
+              <w:t xml:space="preserve">运输路线上试验室门体的联网开门设备，含电动开门机、联网门控控制器（以太网接口，接收调度系统开门指令）、开门到位信号反馈及安装调试</w:t>
             </w:r>
           </w:p>
         </w:tc>
@@ -11992,7 +10389,7 @@
                 <w:szCs w:val="18"/>
                 <w:lang w:val="en-US" w:eastAsia="zh-CN"/>
               </w:rPr>
-              <w:t xml:space="preserve">项</w:t>
+              <w:t xml:space="preserve">扇</w:t>
             </w:r>
           </w:p>
         </w:tc>
@@ -12027,7 +10424,7 @@
                 <w:szCs w:val="18"/>
                 <w:lang w:val="en-US" w:eastAsia="zh-CN"/>
               </w:rPr>
-              <w:t xml:space="preserve">1</w:t>
+              <w:t xml:space="preserve">8</w:t>
             </w:r>
           </w:p>
         </w:tc>
@@ -12062,7 +10459,7 @@
                 <w:szCs w:val="18"/>
                 <w:lang w:val="en-US" w:eastAsia="zh-CN"/>
               </w:rPr>
-              <w:t xml:space="preserve">20,000</w:t>
+              <w:t xml:space="preserve">8,000</w:t>
             </w:r>
           </w:p>
         </w:tc>
@@ -12097,7 +10494,7 @@
                 <w:szCs w:val="18"/>
                 <w:lang w:val="en-US" w:eastAsia="zh-CN"/>
               </w:rPr>
-              <w:t xml:space="preserve">20,000</w:t>
+              <w:t xml:space="preserve">64,000</w:t>
             </w:r>
           </w:p>
         </w:tc>
@@ -12132,7 +10529,7 @@
                 <w:szCs w:val="18"/>
                 <w:lang w:val="en-US" w:eastAsia="zh-CN"/>
               </w:rPr>
-              <w:t xml:space="preserve"/>
+              <w:t xml:space="preserve">含安装调试；门型与尺寸以现场勘察为准</w:t>
             </w:r>
           </w:p>
         </w:tc>
@@ -12173,7 +10570,7 @@
                 <w:szCs w:val="18"/>
                 <w:lang w:val="en-US" w:eastAsia="zh-CN"/>
               </w:rPr>
-              <w:t xml:space="preserve">委托受理</w:t>
+              <w:t xml:space="preserve">门禁与显示设备</w:t>
             </w:r>
           </w:p>
         </w:tc>
@@ -12243,7 +10640,7 @@
                 <w:szCs w:val="18"/>
                 <w:lang w:val="en-US" w:eastAsia="zh-CN"/>
               </w:rPr>
-              <w:t xml:space="preserve">委托进度推送</w:t>
+              <w:t xml:space="preserve">委托前台引导屏</w:t>
             </w:r>
           </w:p>
         </w:tc>
@@ -12278,7 +10675,7 @@
                 <w:szCs w:val="18"/>
                 <w:lang w:val="en-US" w:eastAsia="zh-CN"/>
               </w:rPr>
-              <w:t xml:space="preserve">按受理、检测、报告出具等节点通过小程序或短信推送进度</w:t>
+              <w:t xml:space="preserve">55英寸商用显示屏，用于滚动展示当日及次日试验任务</w:t>
             </w:r>
           </w:p>
         </w:tc>
@@ -12313,7 +10710,7 @@
                 <w:szCs w:val="18"/>
                 <w:lang w:val="en-US" w:eastAsia="zh-CN"/>
               </w:rPr>
-              <w:t xml:space="preserve">项</w:t>
+              <w:t xml:space="preserve">台</w:t>
             </w:r>
           </w:p>
         </w:tc>
@@ -12383,7 +10780,7 @@
                 <w:szCs w:val="18"/>
                 <w:lang w:val="en-US" w:eastAsia="zh-CN"/>
               </w:rPr>
-              <w:t xml:space="preserve">10,000</w:t>
+              <w:t xml:space="preserve">8,000</w:t>
             </w:r>
           </w:p>
         </w:tc>
@@ -12418,7 +10815,7 @@
                 <w:szCs w:val="18"/>
                 <w:lang w:val="en-US" w:eastAsia="zh-CN"/>
               </w:rPr>
-              <w:t xml:space="preserve">10,000</w:t>
+              <w:t xml:space="preserve">8,000</w:t>
             </w:r>
           </w:p>
         </w:tc>
@@ -12453,7 +10850,7 @@
                 <w:szCs w:val="18"/>
                 <w:lang w:val="en-US" w:eastAsia="zh-CN"/>
               </w:rPr>
-              <w:t xml:space="preserve">短信费用按实际发生</w:t>
+              <w:t xml:space="preserve">含支架与安装</w:t>
             </w:r>
           </w:p>
         </w:tc>
@@ -12494,7 +10891,7 @@
                 <w:szCs w:val="18"/>
                 <w:lang w:val="en-US" w:eastAsia="zh-CN"/>
               </w:rPr>
-              <w:t xml:space="preserve">委托受理</w:t>
+              <w:t xml:space="preserve">数据采集设备</w:t>
             </w:r>
           </w:p>
         </w:tc>
@@ -12564,7 +10961,7 @@
                 <w:szCs w:val="18"/>
                 <w:lang w:val="en-US" w:eastAsia="zh-CN"/>
               </w:rPr>
-              <w:t xml:space="preserve">引导屏任务展示</w:t>
+              <w:t xml:space="preserve">边缘采集网关</w:t>
             </w:r>
           </w:p>
         </w:tc>
@@ -12599,7 +10996,7 @@
                 <w:szCs w:val="18"/>
                 <w:lang w:val="en-US" w:eastAsia="zh-CN"/>
               </w:rPr>
-              <w:t xml:space="preserve">委托前台引导屏展示当日及次日试验任务，按试验时间排期滚动显示</w:t>
+              <w:t xml:space="preserve">支持RS232/RS485串口与以太网接口，用于采集试验设备通信数据</w:t>
             </w:r>
           </w:p>
         </w:tc>
@@ -12634,7 +11031,7 @@
                 <w:szCs w:val="18"/>
                 <w:lang w:val="en-US" w:eastAsia="zh-CN"/>
               </w:rPr>
-              <w:t xml:space="preserve">项</w:t>
+              <w:t xml:space="preserve">台</w:t>
             </w:r>
           </w:p>
         </w:tc>
@@ -12669,7 +11066,7 @@
                 <w:szCs w:val="18"/>
                 <w:lang w:val="en-US" w:eastAsia="zh-CN"/>
               </w:rPr>
-              <w:t xml:space="preserve">1</w:t>
+              <w:t xml:space="preserve">4</w:t>
             </w:r>
           </w:p>
         </w:tc>
@@ -12704,7 +11101,7 @@
                 <w:szCs w:val="18"/>
                 <w:lang w:val="en-US" w:eastAsia="zh-CN"/>
               </w:rPr>
-              <w:t xml:space="preserve">10,000</w:t>
+              <w:t xml:space="preserve">3,000</w:t>
             </w:r>
           </w:p>
         </w:tc>
@@ -12739,7 +11136,7 @@
                 <w:szCs w:val="18"/>
                 <w:lang w:val="en-US" w:eastAsia="zh-CN"/>
               </w:rPr>
-              <w:t xml:space="preserve">10,000</w:t>
+              <w:t xml:space="preserve">12,000</w:t>
             </w:r>
           </w:p>
         </w:tc>
@@ -12774,7 +11171,7 @@
                 <w:szCs w:val="18"/>
                 <w:lang w:val="en-US" w:eastAsia="zh-CN"/>
               </w:rPr>
-              <w:t xml:space="preserve"/>
+              <w:t xml:space="preserve">数量以接入设备为准</w:t>
             </w:r>
           </w:p>
         </w:tc>
@@ -12815,7 +11212,7 @@
                 <w:szCs w:val="18"/>
                 <w:lang w:val="en-US" w:eastAsia="zh-CN"/>
               </w:rPr>
-              <w:t xml:space="preserve">任务下发</w:t>
+              <w:t xml:space="preserve">硬件小计</w:t>
             </w:r>
           </w:p>
         </w:tc>
@@ -12850,7 +11247,7 @@
                 <w:szCs w:val="18"/>
                 <w:lang w:val="en-US" w:eastAsia="zh-CN"/>
               </w:rPr>
-              <w:t xml:space="preserve">5</w:t>
+              <w:t xml:space="preserve"/>
             </w:r>
           </w:p>
         </w:tc>
@@ -12885,7 +11282,7 @@
                 <w:szCs w:val="18"/>
                 <w:lang w:val="en-US" w:eastAsia="zh-CN"/>
               </w:rPr>
-              <w:t xml:space="preserve">任务自动派发</w:t>
+              <w:t xml:space="preserve"/>
             </w:r>
           </w:p>
         </w:tc>
@@ -12920,7 +11317,7 @@
                 <w:szCs w:val="18"/>
                 <w:lang w:val="en-US" w:eastAsia="zh-CN"/>
               </w:rPr>
-              <w:t xml:space="preserve">受理完成后自动生成检测任务并分派试验人员，同步生成运输任务</w:t>
+              <w:t xml:space="preserve"/>
             </w:r>
           </w:p>
         </w:tc>
@@ -12955,7 +11352,7 @@
                 <w:szCs w:val="18"/>
                 <w:lang w:val="en-US" w:eastAsia="zh-CN"/>
               </w:rPr>
-              <w:t xml:space="preserve">项</w:t>
+              <w:t xml:space="preserve"/>
             </w:r>
           </w:p>
         </w:tc>
@@ -12990,7 +11387,7 @@
                 <w:szCs w:val="18"/>
                 <w:lang w:val="en-US" w:eastAsia="zh-CN"/>
               </w:rPr>
-              <w:t xml:space="preserve">1</w:t>
+              <w:t xml:space="preserve"/>
             </w:r>
           </w:p>
         </w:tc>
@@ -13025,7 +11422,7 @@
                 <w:szCs w:val="18"/>
                 <w:lang w:val="en-US" w:eastAsia="zh-CN"/>
               </w:rPr>
-              <w:t xml:space="preserve">20,000</w:t>
+              <w:t xml:space="preserve"/>
             </w:r>
           </w:p>
         </w:tc>
@@ -13060,7 +11457,7 @@
                 <w:szCs w:val="18"/>
                 <w:lang w:val="en-US" w:eastAsia="zh-CN"/>
               </w:rPr>
-              <w:t xml:space="preserve">20,000</w:t>
+              <w:t xml:space="preserve">284,000</w:t>
             </w:r>
           </w:p>
         </w:tc>
@@ -13096,6 +11493,441 @@
                 <w:lang w:val="en-US" w:eastAsia="zh-CN"/>
               </w:rPr>
               <w:t xml:space="preserve"/>
+            </w:r>
+          </w:p>
+        </w:tc>
+      </w:tr>
+    </w:tbl>
+    <w:p>
+      <w:pPr>
+        <w:spacing w:after="0" w:line="20" w:lineRule="exact"/>
+        <w:rPr>
+          <w:sz w:val="2"/>
+        </w:rPr>
+      </w:pPr>
+    </w:p>
+    <w:p>
+      <w:pPr>
+        <w:keepNext/>
+        <w:keepLines w:val="0"/>
+        <w:pageBreakBefore w:val="0"/>
+        <w:widowControl/>
+        <w:kinsoku w:val="0"/>
+        <w:wordWrap/>
+        <w:overflowPunct/>
+        <w:topLinePunct w:val="0"/>
+        <w:autoSpaceDE w:val="0"/>
+        <w:autoSpaceDN w:val="0"/>
+        <w:bidi w:val="0"/>
+        <w:adjustRightInd w:val="0"/>
+        <w:snapToGrid w:val="0"/>
+        <w:spacing w:before="120" w:after="0" w:line="360" w:lineRule="auto"/>
+        <w:ind w:left="0" w:firstLine="0"/>
+        <w:jc w:val="left"/>
+        <w:textAlignment w:val="baseline"/>
+        <w:outlineLvl w:val="1"/>
+        <w:rPr>
+          <w:rFonts w:hint="eastAsia" w:ascii="宋体" w:hAnsi="宋体" w:eastAsia="宋体" w:cs="宋体"/>
+          <w:b/>
+          <w:snapToGrid w:val="0"/>
+          <w:color w:val="000000"/>
+          <w:sz w:val="28"/>
+          <w:szCs w:val="28"/>
+          <w:lang w:val="en-US" w:eastAsia="zh-CN" w:bidi="ar-SA"/>
+        </w:rPr>
+      </w:pPr>
+      <w:bookmarkStart w:id="127" w:name="_Toc900127"/>
+      <w:r>
+        <w:rPr>
+          <w:rFonts w:hint="eastAsia" w:ascii="宋体" w:hAnsi="宋体" w:eastAsia="宋体" w:cs="宋体"/>
+          <w:b/>
+          <w:snapToGrid w:val="0"/>
+          <w:color w:val="000000"/>
+          <w:sz w:val="28"/>
+          <w:szCs w:val="28"/>
+          <w:lang w:val="en-US" w:eastAsia="zh-CN" w:bidi="ar-SA"/>
+        </w:rPr>
+        <w:t>5.3 软件报价清单</w:t>
+      </w:r>
+      <w:bookmarkEnd w:id="127"/>
+    </w:p>
+    <w:tbl>
+      <w:tblPr>
+        <w:tblStyle w:val="15"/>
+        <w:tblW w:w="8306" w:type="dxa"/>
+        <w:jc w:val="center"/>
+        <w:tblBorders>
+          <w:top w:val="single" w:color="D9D9D9" w:sz="6" w:space="0"/>
+          <w:left w:val="single" w:color="D9D9D9" w:sz="6" w:space="0"/>
+          <w:bottom w:val="single" w:color="D9D9D9" w:sz="6" w:space="0"/>
+          <w:right w:val="single" w:color="D9D9D9" w:sz="6" w:space="0"/>
+          <w:insideH w:val="single" w:color="D9D9D9" w:sz="6" w:space="0"/>
+          <w:insideV w:val="single" w:color="D9D9D9" w:sz="6" w:space="0"/>
+        </w:tblBorders>
+        <w:tblLayout w:type="fixed"/>
+        <w:tblCellMar>
+          <w:top w:w="0" w:type="dxa"/>
+          <w:left w:w="108" w:type="dxa"/>
+          <w:bottom w:w="0" w:type="dxa"/>
+          <w:right w:w="108" w:type="dxa"/>
+        </w:tblCellMar>
+      </w:tblPr>
+      <w:tblGrid>
+        <w:gridCol w:w="672"/>
+        <w:gridCol w:w="480"/>
+        <w:gridCol w:w="912"/>
+        <w:gridCol w:w="2400"/>
+        <w:gridCol w:w="432"/>
+        <w:gridCol w:w="528"/>
+        <w:gridCol w:w="960"/>
+        <w:gridCol w:w="1008"/>
+        <w:gridCol w:w="914"/>
+      </w:tblGrid>
+      <w:tr>
+        <w:trPr>
+          <w:cantSplit/>
+          <w:tblHeader/>
+          <w:jc w:val="center"/>
+        </w:trPr>
+        <w:tc>
+          <w:tcPr>
+            <w:tcW w:w="672" w:type="dxa"/>
+            <w:shd w:val="clear" w:color="auto" w:fill="17365D"/>
+            <w:tcMar>
+              <w:top w:w="100" w:type="dxa"/>
+              <w:left w:w="60" w:type="dxa"/>
+              <w:bottom w:w="100" w:type="dxa"/>
+              <w:right w:w="60" w:type="dxa"/>
+            </w:tcMar>
+            <w:vAlign w:val="center"/>
+          </w:tcPr>
+          <w:p>
+            <w:pPr>
+              <w:spacing w:before="0" w:after="0" w:line="269" w:lineRule="auto"/>
+              <w:jc w:val="center"/>
+              <w:rPr>
+                <w:rFonts w:hint="eastAsia" w:ascii="宋体" w:hAnsi="宋体" w:eastAsia="宋体" w:cs="宋体"/>
+                <w:b/>
+                <w:color w:val="FFFFFF"/>
+                <w:sz w:val="18"/>
+                <w:szCs w:val="18"/>
+                <w:lang w:val="en-US" w:eastAsia="zh-CN"/>
+              </w:rPr>
+            </w:pPr>
+            <w:r>
+              <w:rPr>
+                <w:rFonts w:hint="eastAsia" w:ascii="宋体" w:hAnsi="宋体" w:eastAsia="宋体" w:cs="宋体"/>
+                <w:b/>
+                <w:color w:val="FFFFFF"/>
+                <w:sz w:val="18"/>
+                <w:szCs w:val="18"/>
+                <w:lang w:val="en-US" w:eastAsia="zh-CN"/>
+              </w:rPr>
+              <w:t xml:space="preserve">名称</w:t>
+            </w:r>
+          </w:p>
+        </w:tc>
+        <w:tc>
+          <w:tcPr>
+            <w:tcW w:w="480" w:type="dxa"/>
+            <w:shd w:val="clear" w:color="auto" w:fill="17365D"/>
+            <w:tcMar>
+              <w:top w:w="100" w:type="dxa"/>
+              <w:left w:w="60" w:type="dxa"/>
+              <w:bottom w:w="100" w:type="dxa"/>
+              <w:right w:w="60" w:type="dxa"/>
+            </w:tcMar>
+            <w:vAlign w:val="center"/>
+          </w:tcPr>
+          <w:p>
+            <w:pPr>
+              <w:spacing w:before="0" w:after="0" w:line="269" w:lineRule="auto"/>
+              <w:jc w:val="center"/>
+              <w:rPr>
+                <w:rFonts w:hint="eastAsia" w:ascii="宋体" w:hAnsi="宋体" w:eastAsia="宋体" w:cs="宋体"/>
+                <w:b/>
+                <w:color w:val="FFFFFF"/>
+                <w:sz w:val="18"/>
+                <w:szCs w:val="18"/>
+                <w:lang w:val="en-US" w:eastAsia="zh-CN"/>
+              </w:rPr>
+            </w:pPr>
+            <w:r>
+              <w:rPr>
+                <w:rFonts w:hint="eastAsia" w:ascii="宋体" w:hAnsi="宋体" w:eastAsia="宋体" w:cs="宋体"/>
+                <w:b/>
+                <w:color w:val="FFFFFF"/>
+                <w:sz w:val="18"/>
+                <w:szCs w:val="18"/>
+                <w:lang w:val="en-US" w:eastAsia="zh-CN"/>
+              </w:rPr>
+              <w:t xml:space="preserve">序号</w:t>
+            </w:r>
+          </w:p>
+        </w:tc>
+        <w:tc>
+          <w:tcPr>
+            <w:tcW w:w="912" w:type="dxa"/>
+            <w:shd w:val="clear" w:color="auto" w:fill="17365D"/>
+            <w:tcMar>
+              <w:top w:w="100" w:type="dxa"/>
+              <w:left w:w="60" w:type="dxa"/>
+              <w:bottom w:w="100" w:type="dxa"/>
+              <w:right w:w="60" w:type="dxa"/>
+            </w:tcMar>
+            <w:vAlign w:val="center"/>
+          </w:tcPr>
+          <w:p>
+            <w:pPr>
+              <w:spacing w:before="0" w:after="0" w:line="269" w:lineRule="auto"/>
+              <w:jc w:val="center"/>
+              <w:rPr>
+                <w:rFonts w:hint="eastAsia" w:ascii="宋体" w:hAnsi="宋体" w:eastAsia="宋体" w:cs="宋体"/>
+                <w:b/>
+                <w:color w:val="FFFFFF"/>
+                <w:sz w:val="18"/>
+                <w:szCs w:val="18"/>
+                <w:lang w:val="en-US" w:eastAsia="zh-CN"/>
+              </w:rPr>
+            </w:pPr>
+            <w:r>
+              <w:rPr>
+                <w:rFonts w:hint="eastAsia" w:ascii="宋体" w:hAnsi="宋体" w:eastAsia="宋体" w:cs="宋体"/>
+                <w:b/>
+                <w:color w:val="FFFFFF"/>
+                <w:sz w:val="18"/>
+                <w:szCs w:val="18"/>
+                <w:lang w:val="en-US" w:eastAsia="zh-CN"/>
+              </w:rPr>
+              <w:t xml:space="preserve">模块名称</w:t>
+            </w:r>
+          </w:p>
+        </w:tc>
+        <w:tc>
+          <w:tcPr>
+            <w:tcW w:w="2400" w:type="dxa"/>
+            <w:shd w:val="clear" w:color="auto" w:fill="17365D"/>
+            <w:tcMar>
+              <w:top w:w="100" w:type="dxa"/>
+              <w:left w:w="60" w:type="dxa"/>
+              <w:bottom w:w="100" w:type="dxa"/>
+              <w:right w:w="60" w:type="dxa"/>
+            </w:tcMar>
+            <w:vAlign w:val="center"/>
+          </w:tcPr>
+          <w:p>
+            <w:pPr>
+              <w:spacing w:before="0" w:after="0" w:line="269" w:lineRule="auto"/>
+              <w:jc w:val="center"/>
+              <w:rPr>
+                <w:rFonts w:hint="eastAsia" w:ascii="宋体" w:hAnsi="宋体" w:eastAsia="宋体" w:cs="宋体"/>
+                <w:b/>
+                <w:color w:val="FFFFFF"/>
+                <w:sz w:val="18"/>
+                <w:szCs w:val="18"/>
+                <w:lang w:val="en-US" w:eastAsia="zh-CN"/>
+              </w:rPr>
+            </w:pPr>
+            <w:r>
+              <w:rPr>
+                <w:rFonts w:hint="eastAsia" w:ascii="宋体" w:hAnsi="宋体" w:eastAsia="宋体" w:cs="宋体"/>
+                <w:b/>
+                <w:color w:val="FFFFFF"/>
+                <w:sz w:val="18"/>
+                <w:szCs w:val="18"/>
+                <w:lang w:val="en-US" w:eastAsia="zh-CN"/>
+              </w:rPr>
+              <w:t xml:space="preserve">项目特征与需求描述</w:t>
+            </w:r>
+          </w:p>
+        </w:tc>
+        <w:tc>
+          <w:tcPr>
+            <w:tcW w:w="432" w:type="dxa"/>
+            <w:shd w:val="clear" w:color="auto" w:fill="17365D"/>
+            <w:tcMar>
+              <w:top w:w="100" w:type="dxa"/>
+              <w:left w:w="60" w:type="dxa"/>
+              <w:bottom w:w="100" w:type="dxa"/>
+              <w:right w:w="60" w:type="dxa"/>
+            </w:tcMar>
+            <w:vAlign w:val="center"/>
+          </w:tcPr>
+          <w:p>
+            <w:pPr>
+              <w:spacing w:before="0" w:after="0" w:line="269" w:lineRule="auto"/>
+              <w:jc w:val="center"/>
+              <w:rPr>
+                <w:rFonts w:hint="eastAsia" w:ascii="宋体" w:hAnsi="宋体" w:eastAsia="宋体" w:cs="宋体"/>
+                <w:b/>
+                <w:color w:val="FFFFFF"/>
+                <w:sz w:val="18"/>
+                <w:szCs w:val="18"/>
+                <w:lang w:val="en-US" w:eastAsia="zh-CN"/>
+              </w:rPr>
+            </w:pPr>
+            <w:r>
+              <w:rPr>
+                <w:rFonts w:hint="eastAsia" w:ascii="宋体" w:hAnsi="宋体" w:eastAsia="宋体" w:cs="宋体"/>
+                <w:b/>
+                <w:color w:val="FFFFFF"/>
+                <w:sz w:val="18"/>
+                <w:szCs w:val="18"/>
+                <w:lang w:val="en-US" w:eastAsia="zh-CN"/>
+              </w:rPr>
+              <w:t xml:space="preserve">单位</w:t>
+            </w:r>
+          </w:p>
+        </w:tc>
+        <w:tc>
+          <w:tcPr>
+            <w:tcW w:w="528" w:type="dxa"/>
+            <w:shd w:val="clear" w:color="auto" w:fill="17365D"/>
+            <w:tcMar>
+              <w:top w:w="100" w:type="dxa"/>
+              <w:left w:w="60" w:type="dxa"/>
+              <w:bottom w:w="100" w:type="dxa"/>
+              <w:right w:w="60" w:type="dxa"/>
+            </w:tcMar>
+            <w:vAlign w:val="center"/>
+          </w:tcPr>
+          <w:p>
+            <w:pPr>
+              <w:spacing w:before="0" w:after="0" w:line="269" w:lineRule="auto"/>
+              <w:jc w:val="center"/>
+              <w:rPr>
+                <w:rFonts w:hint="eastAsia" w:ascii="宋体" w:hAnsi="宋体" w:eastAsia="宋体" w:cs="宋体"/>
+                <w:b/>
+                <w:color w:val="FFFFFF"/>
+                <w:sz w:val="18"/>
+                <w:szCs w:val="18"/>
+                <w:lang w:val="en-US" w:eastAsia="zh-CN"/>
+              </w:rPr>
+            </w:pPr>
+            <w:r>
+              <w:rPr>
+                <w:rFonts w:hint="eastAsia" w:ascii="宋体" w:hAnsi="宋体" w:eastAsia="宋体" w:cs="宋体"/>
+                <w:b/>
+                <w:color w:val="FFFFFF"/>
+                <w:sz w:val="18"/>
+                <w:szCs w:val="18"/>
+                <w:lang w:val="en-US" w:eastAsia="zh-CN"/>
+              </w:rPr>
+              <w:t xml:space="preserve">工程量</w:t>
+            </w:r>
+          </w:p>
+        </w:tc>
+        <w:tc>
+          <w:tcPr>
+            <w:tcW w:w="960" w:type="dxa"/>
+            <w:shd w:val="clear" w:color="auto" w:fill="17365D"/>
+            <w:tcMar>
+              <w:top w:w="100" w:type="dxa"/>
+              <w:left w:w="60" w:type="dxa"/>
+              <w:bottom w:w="100" w:type="dxa"/>
+              <w:right w:w="60" w:type="dxa"/>
+            </w:tcMar>
+            <w:vAlign w:val="center"/>
+          </w:tcPr>
+          <w:p>
+            <w:pPr>
+              <w:spacing w:before="0" w:after="0" w:line="269" w:lineRule="auto"/>
+              <w:jc w:val="center"/>
+              <w:rPr>
+                <w:rFonts w:hint="eastAsia" w:ascii="宋体" w:hAnsi="宋体" w:eastAsia="宋体" w:cs="宋体"/>
+                <w:b/>
+                <w:color w:val="FFFFFF"/>
+                <w:sz w:val="18"/>
+                <w:szCs w:val="18"/>
+                <w:lang w:val="en-US" w:eastAsia="zh-CN"/>
+              </w:rPr>
+            </w:pPr>
+            <w:r>
+              <w:rPr>
+                <w:rFonts w:hint="eastAsia" w:ascii="宋体" w:hAnsi="宋体" w:eastAsia="宋体" w:cs="宋体"/>
+                <w:b/>
+                <w:color w:val="FFFFFF"/>
+                <w:sz w:val="18"/>
+                <w:szCs w:val="18"/>
+                <w:lang w:val="en-US" w:eastAsia="zh-CN"/>
+              </w:rPr>
+              <w:t xml:space="preserve">单价（元）</w:t>
+            </w:r>
+          </w:p>
+        </w:tc>
+        <w:tc>
+          <w:tcPr>
+            <w:tcW w:w="1008" w:type="dxa"/>
+            <w:shd w:val="clear" w:color="auto" w:fill="17365D"/>
+            <w:tcMar>
+              <w:top w:w="100" w:type="dxa"/>
+              <w:left w:w="60" w:type="dxa"/>
+              <w:bottom w:w="100" w:type="dxa"/>
+              <w:right w:w="60" w:type="dxa"/>
+            </w:tcMar>
+            <w:vAlign w:val="center"/>
+          </w:tcPr>
+          <w:p>
+            <w:pPr>
+              <w:spacing w:before="0" w:after="0" w:line="269" w:lineRule="auto"/>
+              <w:jc w:val="center"/>
+              <w:rPr>
+                <w:rFonts w:hint="eastAsia" w:ascii="宋体" w:hAnsi="宋体" w:eastAsia="宋体" w:cs="宋体"/>
+                <w:b/>
+                <w:color w:val="FFFFFF"/>
+                <w:sz w:val="18"/>
+                <w:szCs w:val="18"/>
+                <w:lang w:val="en-US" w:eastAsia="zh-CN"/>
+              </w:rPr>
+            </w:pPr>
+            <w:r>
+              <w:rPr>
+                <w:rFonts w:hint="eastAsia" w:ascii="宋体" w:hAnsi="宋体" w:eastAsia="宋体" w:cs="宋体"/>
+                <w:b/>
+                <w:color w:val="FFFFFF"/>
+                <w:sz w:val="18"/>
+                <w:szCs w:val="18"/>
+                <w:lang w:val="en-US" w:eastAsia="zh-CN"/>
+              </w:rPr>
+              <w:t xml:space="preserve">合价（元）</w:t>
+            </w:r>
+          </w:p>
+        </w:tc>
+        <w:tc>
+          <w:tcPr>
+            <w:tcW w:w="914" w:type="dxa"/>
+            <w:shd w:val="clear" w:color="auto" w:fill="17365D"/>
+            <w:tcMar>
+              <w:top w:w="100" w:type="dxa"/>
+              <w:left w:w="60" w:type="dxa"/>
+              <w:bottom w:w="100" w:type="dxa"/>
+              <w:right w:w="60" w:type="dxa"/>
+            </w:tcMar>
+            <w:vAlign w:val="center"/>
+          </w:tcPr>
+          <w:p>
+            <w:pPr>
+              <w:spacing w:before="0" w:after="0" w:line="269" w:lineRule="auto"/>
+              <w:jc w:val="center"/>
+              <w:rPr>
+                <w:rFonts w:hint="eastAsia" w:ascii="宋体" w:hAnsi="宋体" w:eastAsia="宋体" w:cs="宋体"/>
+                <w:b/>
+                <w:color w:val="FFFFFF"/>
+                <w:sz w:val="18"/>
+                <w:szCs w:val="18"/>
+                <w:lang w:val="en-US" w:eastAsia="zh-CN"/>
+              </w:rPr>
+            </w:pPr>
+            <w:r>
+              <w:rPr>
+                <w:rFonts w:hint="eastAsia" w:ascii="宋体" w:hAnsi="宋体" w:eastAsia="宋体" w:cs="宋体"/>
+                <w:b/>
+                <w:color w:val="FFFFFF"/>
+                <w:sz w:val="18"/>
+                <w:szCs w:val="18"/>
+                <w:lang w:val="en-US" w:eastAsia="zh-CN"/>
+              </w:rPr>
+              <w:t xml:space="preserve">备注</w:t>
             </w:r>
           </w:p>
         </w:tc>
@@ -13136,7 +11968,7 @@
                 <w:szCs w:val="18"/>
                 <w:lang w:val="en-US" w:eastAsia="zh-CN"/>
               </w:rPr>
-              <w:t xml:space="preserve">任务下发</w:t>
+              <w:t xml:space="preserve">委托受理</w:t>
             </w:r>
           </w:p>
         </w:tc>
@@ -13171,7 +12003,7 @@
                 <w:szCs w:val="18"/>
                 <w:lang w:val="en-US" w:eastAsia="zh-CN"/>
               </w:rPr>
-              <w:t xml:space="preserve">6</w:t>
+              <w:t xml:space="preserve">1</w:t>
             </w:r>
           </w:p>
         </w:tc>
@@ -13206,7 +12038,7 @@
                 <w:szCs w:val="18"/>
                 <w:lang w:val="en-US" w:eastAsia="zh-CN"/>
               </w:rPr>
-              <w:t xml:space="preserve">移动端任务通知</w:t>
+              <w:t xml:space="preserve">扫码预委托小程序</w:t>
             </w:r>
           </w:p>
         </w:tc>
@@ -13241,7 +12073,7 @@
                 <w:szCs w:val="18"/>
                 <w:lang w:val="en-US" w:eastAsia="zh-CN"/>
               </w:rPr>
-              <w:t xml:space="preserve">试验人员移动端任务推送、样品送达提醒与任务确认</w:t>
+              <w:t xml:space="preserve">小程序端委托填报，支持历史信息自动带出、纸质委托单拍照上传与委托记录查询</w:t>
             </w:r>
           </w:p>
         </w:tc>
@@ -13346,7 +12178,7 @@
                 <w:szCs w:val="18"/>
                 <w:lang w:val="en-US" w:eastAsia="zh-CN"/>
               </w:rPr>
-              <w:t xml:space="preserve">15,000</w:t>
+              <w:t xml:space="preserve">55,000</w:t>
             </w:r>
           </w:p>
         </w:tc>
@@ -13381,7 +12213,7 @@
                 <w:szCs w:val="18"/>
                 <w:lang w:val="en-US" w:eastAsia="zh-CN"/>
               </w:rPr>
-              <w:t xml:space="preserve">15,000</w:t>
+              <w:t xml:space="preserve">55,000</w:t>
             </w:r>
           </w:p>
         </w:tc>
@@ -13457,7 +12289,7 @@
                 <w:szCs w:val="18"/>
                 <w:lang w:val="en-US" w:eastAsia="zh-CN"/>
               </w:rPr>
-              <w:t xml:space="preserve">任务下发</w:t>
+              <w:t xml:space="preserve">委托受理</w:t>
             </w:r>
           </w:p>
         </w:tc>
@@ -13492,7 +12324,7 @@
                 <w:szCs w:val="18"/>
                 <w:lang w:val="en-US" w:eastAsia="zh-CN"/>
               </w:rPr>
-              <w:t xml:space="preserve">7</w:t>
+              <w:t xml:space="preserve">2</w:t>
             </w:r>
           </w:p>
         </w:tc>
@@ -13527,7 +12359,7 @@
                 <w:szCs w:val="18"/>
                 <w:lang w:val="en-US" w:eastAsia="zh-CN"/>
               </w:rPr>
-              <w:t xml:space="preserve">试验室信息屏动态显示</w:t>
+              <w:t xml:space="preserve">委托数据联动接口</w:t>
             </w:r>
           </w:p>
         </w:tc>
@@ -13562,7 +12394,7 @@
                 <w:szCs w:val="18"/>
                 <w:lang w:val="en-US" w:eastAsia="zh-CN"/>
               </w:rPr>
-              <w:t xml:space="preserve">试验室信息屏按任务数据自动显示当前委托、样品、检测项目与任务状态</w:t>
+              <w:t xml:space="preserve">与委托系统的数据同步，委托、样品、检测项目的结构化关联</w:t>
             </w:r>
           </w:p>
         </w:tc>
@@ -13667,7 +12499,7 @@
                 <w:szCs w:val="18"/>
                 <w:lang w:val="en-US" w:eastAsia="zh-CN"/>
               </w:rPr>
-              <w:t xml:space="preserve">10,000</w:t>
+              <w:t xml:space="preserve">20,000</w:t>
             </w:r>
           </w:p>
         </w:tc>
@@ -13702,7 +12534,7 @@
                 <w:szCs w:val="18"/>
                 <w:lang w:val="en-US" w:eastAsia="zh-CN"/>
               </w:rPr>
-              <w:t xml:space="preserve">10,000</w:t>
+              <w:t xml:space="preserve">20,000</w:t>
             </w:r>
           </w:p>
         </w:tc>
@@ -13778,7 +12610,7 @@
                 <w:szCs w:val="18"/>
                 <w:lang w:val="en-US" w:eastAsia="zh-CN"/>
               </w:rPr>
-              <w:t xml:space="preserve">任务下发</w:t>
+              <w:t xml:space="preserve">委托受理</w:t>
             </w:r>
           </w:p>
         </w:tc>
@@ -13813,7 +12645,7 @@
                 <w:szCs w:val="18"/>
                 <w:lang w:val="en-US" w:eastAsia="zh-CN"/>
               </w:rPr>
-              <w:t xml:space="preserve">8</w:t>
+              <w:t xml:space="preserve">3</w:t>
             </w:r>
           </w:p>
         </w:tc>
@@ -13848,7 +12680,7 @@
                 <w:szCs w:val="18"/>
                 <w:lang w:val="en-US" w:eastAsia="zh-CN"/>
               </w:rPr>
-              <w:t xml:space="preserve">门禁与任务关联</w:t>
+              <w:t xml:space="preserve">委托进度推送</w:t>
             </w:r>
           </w:p>
         </w:tc>
@@ -13883,7 +12715,7 @@
                 <w:szCs w:val="18"/>
                 <w:lang w:val="en-US" w:eastAsia="zh-CN"/>
               </w:rPr>
-              <w:t xml:space="preserve">门禁身份核验记录与试验任务自动关联</w:t>
+              <w:t xml:space="preserve">按受理、检测、报告出具等节点通过小程序或短信推送进度</w:t>
             </w:r>
           </w:p>
         </w:tc>
@@ -14058,7 +12890,7 @@
                 <w:szCs w:val="18"/>
                 <w:lang w:val="en-US" w:eastAsia="zh-CN"/>
               </w:rPr>
-              <w:t xml:space="preserve"/>
+              <w:t xml:space="preserve">短信费用按实际发生</w:t>
             </w:r>
           </w:p>
         </w:tc>
@@ -14099,7 +12931,7 @@
                 <w:szCs w:val="18"/>
                 <w:lang w:val="en-US" w:eastAsia="zh-CN"/>
               </w:rPr>
-              <w:t xml:space="preserve">任务下发</w:t>
+              <w:t xml:space="preserve">委托受理</w:t>
             </w:r>
           </w:p>
         </w:tc>
@@ -14134,7 +12966,7 @@
                 <w:szCs w:val="18"/>
                 <w:lang w:val="en-US" w:eastAsia="zh-CN"/>
               </w:rPr>
-              <w:t xml:space="preserve">9</w:t>
+              <w:t xml:space="preserve">4</w:t>
             </w:r>
           </w:p>
         </w:tc>
@@ -14169,7 +13001,7 @@
                 <w:szCs w:val="18"/>
                 <w:lang w:val="en-US" w:eastAsia="zh-CN"/>
               </w:rPr>
-              <w:t xml:space="preserve">进门语音提示</w:t>
+              <w:t xml:space="preserve">引导屏任务展示</w:t>
             </w:r>
           </w:p>
         </w:tc>
@@ -14204,7 +13036,7 @@
                 <w:szCs w:val="18"/>
                 <w:lang w:val="en-US" w:eastAsia="zh-CN"/>
               </w:rPr>
-              <w:t xml:space="preserve">“小浦”在试验人员进入时播报当前任务、样品数量与检测依据</w:t>
+              <w:t xml:space="preserve">委托前台引导屏展示当日及次日试验任务，按试验时间排期滚动显示</w:t>
             </w:r>
           </w:p>
         </w:tc>
@@ -14420,7 +13252,7 @@
                 <w:szCs w:val="18"/>
                 <w:lang w:val="en-US" w:eastAsia="zh-CN"/>
               </w:rPr>
-              <w:t xml:space="preserve">试验数据采集</w:t>
+              <w:t xml:space="preserve">任务下发</w:t>
             </w:r>
           </w:p>
         </w:tc>
@@ -14455,7 +13287,7 @@
                 <w:szCs w:val="18"/>
                 <w:lang w:val="en-US" w:eastAsia="zh-CN"/>
               </w:rPr>
-              <w:t xml:space="preserve">10</w:t>
+              <w:t xml:space="preserve">5</w:t>
             </w:r>
           </w:p>
         </w:tc>
@@ -14490,7 +13322,7 @@
                 <w:szCs w:val="18"/>
                 <w:lang w:val="en-US" w:eastAsia="zh-CN"/>
               </w:rPr>
-              <w:t xml:space="preserve">拍照OCR识别组件</w:t>
+              <w:t xml:space="preserve">任务自动派发</w:t>
             </w:r>
           </w:p>
         </w:tc>
@@ -14525,7 +13357,7 @@
                 <w:szCs w:val="18"/>
                 <w:lang w:val="en-US" w:eastAsia="zh-CN"/>
               </w:rPr>
-              <w:t xml:space="preserve">原始记录表与设备数显屏拍照识别，提取试验数据并写入委托字段</w:t>
+              <w:t xml:space="preserve">受理完成后自动生成检测任务并分派试验人员，同步生成运输任务</w:t>
             </w:r>
           </w:p>
         </w:tc>
@@ -14630,7 +13462,7 @@
                 <w:szCs w:val="18"/>
                 <w:lang w:val="en-US" w:eastAsia="zh-CN"/>
               </w:rPr>
-              <w:t xml:space="preserve">30,000</w:t>
+              <w:t xml:space="preserve">25,000</w:t>
             </w:r>
           </w:p>
         </w:tc>
@@ -14665,7 +13497,7 @@
                 <w:szCs w:val="18"/>
                 <w:lang w:val="en-US" w:eastAsia="zh-CN"/>
               </w:rPr>
-              <w:t xml:space="preserve">30,000</w:t>
+              <w:t xml:space="preserve">25,000</w:t>
             </w:r>
           </w:p>
         </w:tc>
@@ -14741,7 +13573,7 @@
                 <w:szCs w:val="18"/>
                 <w:lang w:val="en-US" w:eastAsia="zh-CN"/>
               </w:rPr>
-              <w:t xml:space="preserve">试验数据采集</w:t>
+              <w:t xml:space="preserve">任务下发</w:t>
             </w:r>
           </w:p>
         </w:tc>
@@ -14776,7 +13608,7 @@
                 <w:szCs w:val="18"/>
                 <w:lang w:val="en-US" w:eastAsia="zh-CN"/>
               </w:rPr>
-              <w:t xml:space="preserve">11</w:t>
+              <w:t xml:space="preserve">6</w:t>
             </w:r>
           </w:p>
         </w:tc>
@@ -14811,7 +13643,7 @@
                 <w:szCs w:val="18"/>
                 <w:lang w:val="en-US" w:eastAsia="zh-CN"/>
               </w:rPr>
-              <w:t xml:space="preserve">人工确认与模型迭代</w:t>
+              <w:t xml:space="preserve">移动端任务通知</w:t>
             </w:r>
           </w:p>
         </w:tc>
@@ -14846,7 +13678,7 @@
                 <w:szCs w:val="18"/>
                 <w:lang w:val="en-US" w:eastAsia="zh-CN"/>
               </w:rPr>
-              <w:t xml:space="preserve">低置信度数据标红提示与人工确认流程，确认数据纳入训练样本迭代识别模型</w:t>
+              <w:t xml:space="preserve">试验人员移动端任务推送、样品送达提醒与任务确认</w:t>
             </w:r>
           </w:p>
         </w:tc>
@@ -14951,7 +13783,7 @@
                 <w:szCs w:val="18"/>
                 <w:lang w:val="en-US" w:eastAsia="zh-CN"/>
               </w:rPr>
-              <w:t xml:space="preserve">20,000</w:t>
+              <w:t xml:space="preserve">15,000</w:t>
             </w:r>
           </w:p>
         </w:tc>
@@ -14986,7 +13818,7 @@
                 <w:szCs w:val="18"/>
                 <w:lang w:val="en-US" w:eastAsia="zh-CN"/>
               </w:rPr>
-              <w:t xml:space="preserve">20,000</w:t>
+              <w:t xml:space="preserve">15,000</w:t>
             </w:r>
           </w:p>
         </w:tc>
@@ -15097,7 +13929,7 @@
                 <w:szCs w:val="18"/>
                 <w:lang w:val="en-US" w:eastAsia="zh-CN"/>
               </w:rPr>
-              <w:t xml:space="preserve">12</w:t>
+              <w:t xml:space="preserve">7</w:t>
             </w:r>
           </w:p>
         </w:tc>
@@ -15132,7 +13964,7 @@
                 <w:szCs w:val="18"/>
                 <w:lang w:val="en-US" w:eastAsia="zh-CN"/>
               </w:rPr>
-              <w:t xml:space="preserve">设备通信协议适配</w:t>
+              <w:t xml:space="preserve">人工确认与模型迭代</w:t>
             </w:r>
           </w:p>
         </w:tc>
@@ -15167,7 +13999,7 @@
                 <w:szCs w:val="18"/>
                 <w:lang w:val="en-US" w:eastAsia="zh-CN"/>
               </w:rPr>
-              <w:t xml:space="preserve">针对万能试验机、压力机等设备开发串口/网口通信协议解析，获取试验曲线与荷载数据</w:t>
+              <w:t xml:space="preserve">低置信度数据标红提示与人工确认流程，确认数据纳入训练样本迭代识别模型</w:t>
             </w:r>
           </w:p>
         </w:tc>
@@ -15202,7 +14034,7 @@
                 <w:szCs w:val="18"/>
                 <w:lang w:val="en-US" w:eastAsia="zh-CN"/>
               </w:rPr>
-              <w:t xml:space="preserve">类</w:t>
+              <w:t xml:space="preserve">项</w:t>
             </w:r>
           </w:p>
         </w:tc>
@@ -15237,7 +14069,7 @@
                 <w:szCs w:val="18"/>
                 <w:lang w:val="en-US" w:eastAsia="zh-CN"/>
               </w:rPr>
-              <w:t xml:space="preserve">4</w:t>
+              <w:t xml:space="preserve">1</w:t>
             </w:r>
           </w:p>
         </w:tc>
@@ -15272,7 +14104,7 @@
                 <w:szCs w:val="18"/>
                 <w:lang w:val="en-US" w:eastAsia="zh-CN"/>
               </w:rPr>
-              <w:t xml:space="preserve">10,000</w:t>
+              <w:t xml:space="preserve">25,000</w:t>
             </w:r>
           </w:p>
         </w:tc>
@@ -15307,7 +14139,7 @@
                 <w:szCs w:val="18"/>
                 <w:lang w:val="en-US" w:eastAsia="zh-CN"/>
               </w:rPr>
-              <w:t xml:space="preserve">40,000</w:t>
+              <w:t xml:space="preserve">25,000</w:t>
             </w:r>
           </w:p>
         </w:tc>
@@ -15342,7 +14174,7 @@
                 <w:szCs w:val="18"/>
                 <w:lang w:val="en-US" w:eastAsia="zh-CN"/>
               </w:rPr>
-              <w:t xml:space="preserve">按设备类型计</w:t>
+              <w:t xml:space="preserve"/>
             </w:r>
           </w:p>
         </w:tc>
@@ -15418,7 +14250,7 @@
                 <w:szCs w:val="18"/>
                 <w:lang w:val="en-US" w:eastAsia="zh-CN"/>
               </w:rPr>
-              <w:t xml:space="preserve">13</w:t>
+              <w:t xml:space="preserve">8</w:t>
             </w:r>
           </w:p>
         </w:tc>
@@ -15453,7 +14285,7 @@
                 <w:szCs w:val="18"/>
                 <w:lang w:val="en-US" w:eastAsia="zh-CN"/>
               </w:rPr>
-              <w:t xml:space="preserve">文件解析与API集成</w:t>
+              <w:t xml:space="preserve">设备通信协议适配</w:t>
             </w:r>
           </w:p>
         </w:tc>
@@ -15488,7 +14320,7 @@
                 <w:szCs w:val="18"/>
                 <w:lang w:val="en-US" w:eastAsia="zh-CN"/>
               </w:rPr>
-              <w:t xml:space="preserve">上位机导出文件（Excel/CSV）自动读取与解析；开放API设备通过HTTP/MQTT对接</w:t>
+              <w:t xml:space="preserve">针对万能试验机、压力机等设备开发串口/网口通信协议解析，获取试验曲线与荷载数据</w:t>
             </w:r>
           </w:p>
         </w:tc>
@@ -15523,7 +14355,7 @@
                 <w:szCs w:val="18"/>
                 <w:lang w:val="en-US" w:eastAsia="zh-CN"/>
               </w:rPr>
-              <w:t xml:space="preserve">项</w:t>
+              <w:t xml:space="preserve">类</w:t>
             </w:r>
           </w:p>
         </w:tc>
@@ -15558,7 +14390,7 @@
                 <w:szCs w:val="18"/>
                 <w:lang w:val="en-US" w:eastAsia="zh-CN"/>
               </w:rPr>
-              <w:t xml:space="preserve">1</w:t>
+              <w:t xml:space="preserve">4</w:t>
             </w:r>
           </w:p>
         </w:tc>
@@ -15593,7 +14425,7 @@
                 <w:szCs w:val="18"/>
                 <w:lang w:val="en-US" w:eastAsia="zh-CN"/>
               </w:rPr>
-              <w:t xml:space="preserve">20,000</w:t>
+              <w:t xml:space="preserve">10,000</w:t>
             </w:r>
           </w:p>
         </w:tc>
@@ -15628,7 +14460,7 @@
                 <w:szCs w:val="18"/>
                 <w:lang w:val="en-US" w:eastAsia="zh-CN"/>
               </w:rPr>
-              <w:t xml:space="preserve">20,000</w:t>
+              <w:t xml:space="preserve">40,000</w:t>
             </w:r>
           </w:p>
         </w:tc>
@@ -15663,7 +14495,7 @@
                 <w:szCs w:val="18"/>
                 <w:lang w:val="en-US" w:eastAsia="zh-CN"/>
               </w:rPr>
-              <w:t xml:space="preserve"/>
+              <w:t xml:space="preserve">按设备类型计</w:t>
             </w:r>
           </w:p>
         </w:tc>
@@ -15739,7 +14571,7 @@
                 <w:szCs w:val="18"/>
                 <w:lang w:val="en-US" w:eastAsia="zh-CN"/>
               </w:rPr>
-              <w:t xml:space="preserve">14</w:t>
+              <w:t xml:space="preserve">9</w:t>
             </w:r>
           </w:p>
         </w:tc>
@@ -15774,7 +14606,7 @@
                 <w:szCs w:val="18"/>
                 <w:lang w:val="en-US" w:eastAsia="zh-CN"/>
               </w:rPr>
-              <w:t xml:space="preserve">采集数据任务关联与校验</w:t>
+              <w:t xml:space="preserve">文件解析与API集成</w:t>
             </w:r>
           </w:p>
         </w:tc>
@@ -15809,7 +14641,7 @@
                 <w:szCs w:val="18"/>
                 <w:lang w:val="en-US" w:eastAsia="zh-CN"/>
               </w:rPr>
-              <w:t xml:space="preserve">采集数据与委托、样品、任务自动关联，漏采、重复与单位异常提示</w:t>
+              <w:t xml:space="preserve">上位机导出文件（Excel/CSV）自动读取与解析；开放API设备通过HTTP/MQTT对接</w:t>
             </w:r>
           </w:p>
         </w:tc>
@@ -15914,7 +14746,7 @@
                 <w:szCs w:val="18"/>
                 <w:lang w:val="en-US" w:eastAsia="zh-CN"/>
               </w:rPr>
-              <w:t xml:space="preserve">15,000</w:t>
+              <w:t xml:space="preserve">25,000</w:t>
             </w:r>
           </w:p>
         </w:tc>
@@ -15949,7 +14781,7 @@
                 <w:szCs w:val="18"/>
                 <w:lang w:val="en-US" w:eastAsia="zh-CN"/>
               </w:rPr>
-              <w:t xml:space="preserve">15,000</w:t>
+              <w:t xml:space="preserve">25,000</w:t>
             </w:r>
           </w:p>
         </w:tc>
@@ -16025,7 +14857,7 @@
                 <w:szCs w:val="18"/>
                 <w:lang w:val="en-US" w:eastAsia="zh-CN"/>
               </w:rPr>
-              <w:t xml:space="preserve">检测报告生成</w:t>
+              <w:t xml:space="preserve">试验数据采集</w:t>
             </w:r>
           </w:p>
         </w:tc>
@@ -16060,7 +14892,7 @@
                 <w:szCs w:val="18"/>
                 <w:lang w:val="en-US" w:eastAsia="zh-CN"/>
               </w:rPr>
-              <w:t xml:space="preserve">15</w:t>
+              <w:t xml:space="preserve">10</w:t>
             </w:r>
           </w:p>
         </w:tc>
@@ -16095,7 +14927,7 @@
                 <w:szCs w:val="18"/>
                 <w:lang w:val="en-US" w:eastAsia="zh-CN"/>
               </w:rPr>
-              <w:t xml:space="preserve">计算公式与判定阈值配置</w:t>
+              <w:t xml:space="preserve">采集数据任务关联与校验</w:t>
             </w:r>
           </w:p>
         </w:tc>
@@ -16130,7 +14962,7 @@
                 <w:szCs w:val="18"/>
                 <w:lang w:val="en-US" w:eastAsia="zh-CN"/>
               </w:rPr>
-              <w:t xml:space="preserve">常规试验项目计算公式调用与标准限值判定规则配置</w:t>
+              <w:t xml:space="preserve">采集数据与委托、样品、任务自动关联，漏采、重复与单位异常提示</w:t>
             </w:r>
           </w:p>
         </w:tc>
@@ -16381,7 +15213,7 @@
                 <w:szCs w:val="18"/>
                 <w:lang w:val="en-US" w:eastAsia="zh-CN"/>
               </w:rPr>
-              <w:t xml:space="preserve">16</w:t>
+              <w:t xml:space="preserve">11</w:t>
             </w:r>
           </w:p>
         </w:tc>
@@ -16416,7 +15248,7 @@
                 <w:szCs w:val="18"/>
                 <w:lang w:val="en-US" w:eastAsia="zh-CN"/>
               </w:rPr>
-              <w:t xml:space="preserve">报告模板引擎</w:t>
+              <w:t xml:space="preserve">计算公式与判定阈值配置</w:t>
             </w:r>
           </w:p>
         </w:tc>
@@ -16451,7 +15283,7 @@
                 <w:szCs w:val="18"/>
                 <w:lang w:val="en-US" w:eastAsia="zh-CN"/>
               </w:rPr>
-              <w:t xml:space="preserve">Word/PDF报告模板匹配与数据填充，支持数据表格与试验曲线插入</w:t>
+              <w:t xml:space="preserve">常规试验项目计算公式调用与标准限值判定规则配置</w:t>
             </w:r>
           </w:p>
         </w:tc>
@@ -16556,7 +15388,7 @@
                 <w:szCs w:val="18"/>
                 <w:lang w:val="en-US" w:eastAsia="zh-CN"/>
               </w:rPr>
-              <w:t xml:space="preserve">40,000</w:t>
+              <w:t xml:space="preserve">25,000</w:t>
             </w:r>
           </w:p>
         </w:tc>
@@ -16591,7 +15423,7 @@
                 <w:szCs w:val="18"/>
                 <w:lang w:val="en-US" w:eastAsia="zh-CN"/>
               </w:rPr>
-              <w:t xml:space="preserve">40,000</w:t>
+              <w:t xml:space="preserve">25,000</w:t>
             </w:r>
           </w:p>
         </w:tc>
@@ -16702,7 +15534,7 @@
                 <w:szCs w:val="18"/>
                 <w:lang w:val="en-US" w:eastAsia="zh-CN"/>
               </w:rPr>
-              <w:t xml:space="preserve">17</w:t>
+              <w:t xml:space="preserve">12</w:t>
             </w:r>
           </w:p>
         </w:tc>
@@ -16737,7 +15569,7 @@
                 <w:szCs w:val="18"/>
                 <w:lang w:val="en-US" w:eastAsia="zh-CN"/>
               </w:rPr>
-              <w:t xml:space="preserve">常规试验报告模板配置</w:t>
+              <w:t xml:space="preserve">报告模板引擎</w:t>
             </w:r>
           </w:p>
         </w:tc>
@@ -16772,7 +15604,7 @@
                 <w:szCs w:val="18"/>
                 <w:lang w:val="en-US" w:eastAsia="zh-CN"/>
               </w:rPr>
-              <w:t xml:space="preserve">按试验项目逐项配置报告模板与字段映射</w:t>
+              <w:t xml:space="preserve">Word/PDF报告模板匹配与数据填充，支持数据表格与试验曲线插入</w:t>
             </w:r>
           </w:p>
         </w:tc>
@@ -16807,7 +15639,7 @@
                 <w:szCs w:val="18"/>
                 <w:lang w:val="en-US" w:eastAsia="zh-CN"/>
               </w:rPr>
-              <w:t xml:space="preserve">个</w:t>
+              <w:t xml:space="preserve">项</w:t>
             </w:r>
           </w:p>
         </w:tc>
@@ -16842,7 +15674,7 @@
                 <w:szCs w:val="18"/>
                 <w:lang w:val="en-US" w:eastAsia="zh-CN"/>
               </w:rPr>
-              <w:t xml:space="preserve">10</w:t>
+              <w:t xml:space="preserve">1</w:t>
             </w:r>
           </w:p>
         </w:tc>
@@ -16877,7 +15709,7 @@
                 <w:szCs w:val="18"/>
                 <w:lang w:val="en-US" w:eastAsia="zh-CN"/>
               </w:rPr>
-              <w:t xml:space="preserve">3,000</w:t>
+              <w:t xml:space="preserve">45,000</w:t>
             </w:r>
           </w:p>
         </w:tc>
@@ -16912,7 +15744,7 @@
                 <w:szCs w:val="18"/>
                 <w:lang w:val="en-US" w:eastAsia="zh-CN"/>
               </w:rPr>
-              <w:t xml:space="preserve">30,000</w:t>
+              <w:t xml:space="preserve">45,000</w:t>
             </w:r>
           </w:p>
         </w:tc>
@@ -16947,7 +15779,7 @@
                 <w:szCs w:val="18"/>
                 <w:lang w:val="en-US" w:eastAsia="zh-CN"/>
               </w:rPr>
-              <w:t xml:space="preserve">首批10类常规试验</w:t>
+              <w:t xml:space="preserve"/>
             </w:r>
           </w:p>
         </w:tc>
@@ -17023,7 +15855,7 @@
                 <w:szCs w:val="18"/>
                 <w:lang w:val="en-US" w:eastAsia="zh-CN"/>
               </w:rPr>
-              <w:t xml:space="preserve">18</w:t>
+              <w:t xml:space="preserve">13</w:t>
             </w:r>
           </w:p>
         </w:tc>
@@ -17058,7 +15890,7 @@
                 <w:szCs w:val="18"/>
                 <w:lang w:val="en-US" w:eastAsia="zh-CN"/>
               </w:rPr>
-              <w:t xml:space="preserve">桥检报告模块集成</w:t>
+              <w:t xml:space="preserve">常规试验报告模板配置</w:t>
             </w:r>
           </w:p>
         </w:tc>
@@ -17093,7 +15925,7 @@
                 <w:szCs w:val="18"/>
                 <w:lang w:val="en-US" w:eastAsia="zh-CN"/>
               </w:rPr>
-              <w:t xml:space="preserve">将现有桥检报告编制框架作为独立功能入口集成至平台</w:t>
+              <w:t xml:space="preserve">按试验项目逐项配置报告模板与字段映射</w:t>
             </w:r>
           </w:p>
         </w:tc>
@@ -17128,7 +15960,7 @@
                 <w:szCs w:val="18"/>
                 <w:lang w:val="en-US" w:eastAsia="zh-CN"/>
               </w:rPr>
-              <w:t xml:space="preserve">项</w:t>
+              <w:t xml:space="preserve">个</w:t>
             </w:r>
           </w:p>
         </w:tc>
@@ -17163,7 +15995,7 @@
                 <w:szCs w:val="18"/>
                 <w:lang w:val="en-US" w:eastAsia="zh-CN"/>
               </w:rPr>
-              <w:t xml:space="preserve">1</w:t>
+              <w:t xml:space="preserve">10</w:t>
             </w:r>
           </w:p>
         </w:tc>
@@ -17198,7 +16030,7 @@
                 <w:szCs w:val="18"/>
                 <w:lang w:val="en-US" w:eastAsia="zh-CN"/>
               </w:rPr>
-              <w:t xml:space="preserve">20,000</w:t>
+              <w:t xml:space="preserve">4,000</w:t>
             </w:r>
           </w:p>
         </w:tc>
@@ -17233,7 +16065,7 @@
                 <w:szCs w:val="18"/>
                 <w:lang w:val="en-US" w:eastAsia="zh-CN"/>
               </w:rPr>
-              <w:t xml:space="preserve">20,000</w:t>
+              <w:t xml:space="preserve">40,000</w:t>
             </w:r>
           </w:p>
         </w:tc>
@@ -17268,7 +16100,7 @@
                 <w:szCs w:val="18"/>
                 <w:lang w:val="en-US" w:eastAsia="zh-CN"/>
               </w:rPr>
-              <w:t xml:space="preserve"/>
+              <w:t xml:space="preserve">首批10类常规试验</w:t>
             </w:r>
           </w:p>
         </w:tc>
@@ -17344,7 +16176,7 @@
                 <w:szCs w:val="18"/>
                 <w:lang w:val="en-US" w:eastAsia="zh-CN"/>
               </w:rPr>
-              <w:t xml:space="preserve">19</w:t>
+              <w:t xml:space="preserve">14</w:t>
             </w:r>
           </w:p>
         </w:tc>
@@ -17379,7 +16211,7 @@
                 <w:szCs w:val="18"/>
                 <w:lang w:val="en-US" w:eastAsia="zh-CN"/>
               </w:rPr>
-              <w:t xml:space="preserve">报告一致性比对与辅助校核</w:t>
+              <w:t xml:space="preserve">桥检报告模块集成</w:t>
             </w:r>
           </w:p>
         </w:tc>
@@ -17414,7 +16246,7 @@
                 <w:szCs w:val="18"/>
                 <w:lang w:val="en-US" w:eastAsia="zh-CN"/>
               </w:rPr>
-              <w:t xml:space="preserve">原始数据与报告数据一致性比对、标准限值复核与错误提示</w:t>
+              <w:t xml:space="preserve">将现有桥检报告编制框架作为独立功能入口集成至平台</w:t>
             </w:r>
           </w:p>
         </w:tc>
@@ -17630,7 +16462,7 @@
                 <w:szCs w:val="18"/>
                 <w:lang w:val="en-US" w:eastAsia="zh-CN"/>
               </w:rPr>
-              <w:t xml:space="preserve">智能交互</w:t>
+              <w:t xml:space="preserve">检测报告生成</w:t>
             </w:r>
           </w:p>
         </w:tc>
@@ -17665,7 +16497,7 @@
                 <w:szCs w:val="18"/>
                 <w:lang w:val="en-US" w:eastAsia="zh-CN"/>
               </w:rPr>
-              <w:t xml:space="preserve">20</w:t>
+              <w:t xml:space="preserve">15</w:t>
             </w:r>
           </w:p>
         </w:tc>
@@ -17700,7 +16532,7 @@
                 <w:szCs w:val="18"/>
                 <w:lang w:val="en-US" w:eastAsia="zh-CN"/>
               </w:rPr>
-              <w:t xml:space="preserve">业务数据中枢</w:t>
+              <w:t xml:space="preserve">报告一致性比对与辅助校核</w:t>
             </w:r>
           </w:p>
         </w:tc>
@@ -17735,7 +16567,7 @@
                 <w:szCs w:val="18"/>
                 <w:lang w:val="en-US" w:eastAsia="zh-CN"/>
               </w:rPr>
-              <w:t xml:space="preserve">汇聚委托、任务、样品与试验数据，统一向“小浦”及各应用提供数据服务</w:t>
+              <w:t xml:space="preserve">原始数据与报告数据一致性比对、标准限值复核与错误提示</w:t>
             </w:r>
           </w:p>
         </w:tc>
@@ -17840,7 +16672,7 @@
                 <w:szCs w:val="18"/>
                 <w:lang w:val="en-US" w:eastAsia="zh-CN"/>
               </w:rPr>
-              <w:t xml:space="preserve">20,000</w:t>
+              <w:t xml:space="preserve">30,000</w:t>
             </w:r>
           </w:p>
         </w:tc>
@@ -17875,7 +16707,7 @@
                 <w:szCs w:val="18"/>
                 <w:lang w:val="en-US" w:eastAsia="zh-CN"/>
               </w:rPr>
-              <w:t xml:space="preserve">20,000</w:t>
+              <w:t xml:space="preserve">30,000</w:t>
             </w:r>
           </w:p>
         </w:tc>
@@ -17986,7 +16818,7 @@
                 <w:szCs w:val="18"/>
                 <w:lang w:val="en-US" w:eastAsia="zh-CN"/>
               </w:rPr>
-              <w:t xml:space="preserve">21</w:t>
+              <w:t xml:space="preserve">16</w:t>
             </w:r>
           </w:p>
         </w:tc>
@@ -18021,7 +16853,7 @@
                 <w:szCs w:val="18"/>
                 <w:lang w:val="en-US" w:eastAsia="zh-CN"/>
               </w:rPr>
-              <w:t xml:space="preserve">“小浦”业务数据接入与权限</w:t>
+              <w:t xml:space="preserve">“小浦”业务工具封装</w:t>
             </w:r>
           </w:p>
         </w:tc>
@@ -18056,7 +16888,7 @@
                 <w:szCs w:val="18"/>
                 <w:lang w:val="en-US" w:eastAsia="zh-CN"/>
               </w:rPr>
-              <w:t xml:space="preserve">结构化业务数据查询接口，按账号角色进行权限过滤</w:t>
+              <w:t xml:space="preserve">将预委托填报、报告校核等高频操作封装为大模型可调用的工具</w:t>
             </w:r>
           </w:p>
         </w:tc>
@@ -18307,7 +17139,7 @@
                 <w:szCs w:val="18"/>
                 <w:lang w:val="en-US" w:eastAsia="zh-CN"/>
               </w:rPr>
-              <w:t xml:space="preserve">22</w:t>
+              <w:t xml:space="preserve">17</w:t>
             </w:r>
           </w:p>
         </w:tc>
@@ -18342,7 +17174,7 @@
                 <w:szCs w:val="18"/>
                 <w:lang w:val="en-US" w:eastAsia="zh-CN"/>
               </w:rPr>
-              <w:t xml:space="preserve">“小浦”业务工具封装</w:t>
+              <w:t xml:space="preserve">委托单信息提取</w:t>
             </w:r>
           </w:p>
         </w:tc>
@@ -18377,7 +17209,7 @@
                 <w:szCs w:val="18"/>
                 <w:lang w:val="en-US" w:eastAsia="zh-CN"/>
               </w:rPr>
-              <w:t xml:space="preserve">将预委托填报、报告校核等高频操作封装为大模型可调用的工具</w:t>
+              <w:t xml:space="preserve">视觉识别模型提取纸质委托单关键信息并映射至标准表单</w:t>
             </w:r>
           </w:p>
         </w:tc>
@@ -18482,7 +17314,7 @@
                 <w:szCs w:val="18"/>
                 <w:lang w:val="en-US" w:eastAsia="zh-CN"/>
               </w:rPr>
-              <w:t xml:space="preserve">15,000</w:t>
+              <w:t xml:space="preserve">10,000</w:t>
             </w:r>
           </w:p>
         </w:tc>
@@ -18517,7 +17349,7 @@
                 <w:szCs w:val="18"/>
                 <w:lang w:val="en-US" w:eastAsia="zh-CN"/>
               </w:rPr>
-              <w:t xml:space="preserve">15,000</w:t>
+              <w:t xml:space="preserve">10,000</w:t>
             </w:r>
           </w:p>
         </w:tc>
@@ -18628,7 +17460,7 @@
                 <w:szCs w:val="18"/>
                 <w:lang w:val="en-US" w:eastAsia="zh-CN"/>
               </w:rPr>
-              <w:t xml:space="preserve">23</w:t>
+              <w:t xml:space="preserve">18</w:t>
             </w:r>
           </w:p>
         </w:tc>
@@ -18663,7 +17495,7 @@
                 <w:szCs w:val="18"/>
                 <w:lang w:val="en-US" w:eastAsia="zh-CN"/>
               </w:rPr>
-              <w:t xml:space="preserve">委托单信息提取</w:t>
+              <w:t xml:space="preserve">多角色业务查询</w:t>
             </w:r>
           </w:p>
         </w:tc>
@@ -18698,7 +17530,7 @@
                 <w:szCs w:val="18"/>
                 <w:lang w:val="en-US" w:eastAsia="zh-CN"/>
               </w:rPr>
-              <w:t xml:space="preserve">视觉识别模型提取纸质委托单关键信息并映射至标准表单</w:t>
+              <w:t xml:space="preserve">面向客户、试验人员、管理人员的自然语言业务查询与汇总答复</w:t>
             </w:r>
           </w:p>
         </w:tc>
@@ -18949,7 +17781,7 @@
                 <w:szCs w:val="18"/>
                 <w:lang w:val="en-US" w:eastAsia="zh-CN"/>
               </w:rPr>
-              <w:t xml:space="preserve">24</w:t>
+              <w:t xml:space="preserve">19</w:t>
             </w:r>
           </w:p>
         </w:tc>
@@ -18984,7 +17816,7 @@
                 <w:szCs w:val="18"/>
                 <w:lang w:val="en-US" w:eastAsia="zh-CN"/>
               </w:rPr>
-              <w:t xml:space="preserve">多角色业务查询</w:t>
+              <w:t xml:space="preserve">大模型调用服务</w:t>
             </w:r>
           </w:p>
         </w:tc>
@@ -19019,7 +17851,7 @@
                 <w:szCs w:val="18"/>
                 <w:lang w:val="en-US" w:eastAsia="zh-CN"/>
               </w:rPr>
-              <w:t xml:space="preserve">面向客户、试验人员、管理人员的自然语言业务查询与汇总答复</w:t>
+              <w:t xml:space="preserve">按调用量（token）计费，月均约数百元</w:t>
             </w:r>
           </w:p>
         </w:tc>
@@ -19054,7 +17886,7 @@
                 <w:szCs w:val="18"/>
                 <w:lang w:val="en-US" w:eastAsia="zh-CN"/>
               </w:rPr>
-              <w:t xml:space="preserve">项</w:t>
+              <w:t xml:space="preserve">年</w:t>
             </w:r>
           </w:p>
         </w:tc>
@@ -19124,7 +17956,7 @@
                 <w:szCs w:val="18"/>
                 <w:lang w:val="en-US" w:eastAsia="zh-CN"/>
               </w:rPr>
-              <w:t xml:space="preserve">10,000</w:t>
+              <w:t xml:space="preserve">6,000</w:t>
             </w:r>
           </w:p>
         </w:tc>
@@ -19159,7 +17991,7 @@
                 <w:szCs w:val="18"/>
                 <w:lang w:val="en-US" w:eastAsia="zh-CN"/>
               </w:rPr>
-              <w:t xml:space="preserve">10,000</w:t>
+              <w:t xml:space="preserve">6,000</w:t>
             </w:r>
           </w:p>
         </w:tc>
@@ -19194,7 +18026,7 @@
                 <w:szCs w:val="18"/>
                 <w:lang w:val="en-US" w:eastAsia="zh-CN"/>
               </w:rPr>
-              <w:t xml:space="preserve"/>
+              <w:t xml:space="preserve">首年</w:t>
             </w:r>
           </w:p>
         </w:tc>
@@ -19235,7 +18067,7 @@
                 <w:szCs w:val="18"/>
                 <w:lang w:val="en-US" w:eastAsia="zh-CN"/>
               </w:rPr>
-              <w:t xml:space="preserve">智能交互</w:t>
+              <w:t xml:space="preserve">系统对接</w:t>
             </w:r>
           </w:p>
         </w:tc>
@@ -19270,7 +18102,7 @@
                 <w:szCs w:val="18"/>
                 <w:lang w:val="en-US" w:eastAsia="zh-CN"/>
               </w:rPr>
-              <w:t xml:space="preserve">25</w:t>
+              <w:t xml:space="preserve">20</w:t>
             </w:r>
           </w:p>
         </w:tc>
@@ -19305,7 +18137,7 @@
                 <w:szCs w:val="18"/>
                 <w:lang w:val="en-US" w:eastAsia="zh-CN"/>
               </w:rPr>
-              <w:t xml:space="preserve">大模型调用服务</w:t>
+              <w:t xml:space="preserve">机器人调度系统对接</w:t>
             </w:r>
           </w:p>
         </w:tc>
@@ -19340,7 +18172,7 @@
                 <w:szCs w:val="18"/>
                 <w:lang w:val="en-US" w:eastAsia="zh-CN"/>
               </w:rPr>
-              <w:t xml:space="preserve">按调用量（token）计费，月均约数百元</w:t>
+              <w:t xml:space="preserve">运输任务下发、机器人位置与状态回传、运输记录与委托任务关联</w:t>
             </w:r>
           </w:p>
         </w:tc>
@@ -19375,7 +18207,7 @@
                 <w:szCs w:val="18"/>
                 <w:lang w:val="en-US" w:eastAsia="zh-CN"/>
               </w:rPr>
-              <w:t xml:space="preserve">年</w:t>
+              <w:t xml:space="preserve">项</w:t>
             </w:r>
           </w:p>
         </w:tc>
@@ -19445,7 +18277,7 @@
                 <w:szCs w:val="18"/>
                 <w:lang w:val="en-US" w:eastAsia="zh-CN"/>
               </w:rPr>
-              <w:t xml:space="preserve">6,000</w:t>
+              <w:t xml:space="preserve">20,000</w:t>
             </w:r>
           </w:p>
         </w:tc>
@@ -19480,7 +18312,7 @@
                 <w:szCs w:val="18"/>
                 <w:lang w:val="en-US" w:eastAsia="zh-CN"/>
               </w:rPr>
-              <w:t xml:space="preserve">6,000</w:t>
+              <w:t xml:space="preserve">20,000</w:t>
             </w:r>
           </w:p>
         </w:tc>
@@ -19515,7 +18347,7 @@
                 <w:szCs w:val="18"/>
                 <w:lang w:val="en-US" w:eastAsia="zh-CN"/>
               </w:rPr>
-              <w:t xml:space="preserve">首年</w:t>
+              <w:t xml:space="preserve"/>
             </w:r>
           </w:p>
         </w:tc>
@@ -19591,7 +18423,7 @@
                 <w:szCs w:val="18"/>
                 <w:lang w:val="en-US" w:eastAsia="zh-CN"/>
               </w:rPr>
-              <w:t xml:space="preserve">26</w:t>
+              <w:t xml:space="preserve">21</w:t>
             </w:r>
           </w:p>
         </w:tc>
@@ -19626,7 +18458,7 @@
                 <w:szCs w:val="18"/>
                 <w:lang w:val="en-US" w:eastAsia="zh-CN"/>
               </w:rPr>
-              <w:t xml:space="preserve">机器人调度系统对接</w:t>
+              <w:t xml:space="preserve">门禁联动控制接口</w:t>
             </w:r>
           </w:p>
         </w:tc>
@@ -19661,7 +18493,7 @@
                 <w:szCs w:val="18"/>
                 <w:lang w:val="en-US" w:eastAsia="zh-CN"/>
               </w:rPr>
-              <w:t xml:space="preserve">运输任务下发、机器人位置与状态回传、运输记录与委托任务关联</w:t>
+              <w:t xml:space="preserve">调度指令与智能门禁的开关门联动控制</w:t>
             </w:r>
           </w:p>
         </w:tc>
@@ -19766,7 +18598,7 @@
                 <w:szCs w:val="18"/>
                 <w:lang w:val="en-US" w:eastAsia="zh-CN"/>
               </w:rPr>
-              <w:t xml:space="preserve">20,000</w:t>
+              <w:t xml:space="preserve">10,000</w:t>
             </w:r>
           </w:p>
         </w:tc>
@@ -19801,7 +18633,7 @@
                 <w:szCs w:val="18"/>
                 <w:lang w:val="en-US" w:eastAsia="zh-CN"/>
               </w:rPr>
-              <w:t xml:space="preserve">20,000</w:t>
+              <w:t xml:space="preserve">10,000</w:t>
             </w:r>
           </w:p>
         </w:tc>
@@ -19877,7 +18709,7 @@
                 <w:szCs w:val="18"/>
                 <w:lang w:val="en-US" w:eastAsia="zh-CN"/>
               </w:rPr>
-              <w:t xml:space="preserve">系统对接</w:t>
+              <w:t xml:space="preserve">实施服务</w:t>
             </w:r>
           </w:p>
         </w:tc>
@@ -19912,7 +18744,7 @@
                 <w:szCs w:val="18"/>
                 <w:lang w:val="en-US" w:eastAsia="zh-CN"/>
               </w:rPr>
-              <w:t xml:space="preserve">27</w:t>
+              <w:t xml:space="preserve">22</w:t>
             </w:r>
           </w:p>
         </w:tc>
@@ -19947,7 +18779,7 @@
                 <w:szCs w:val="18"/>
                 <w:lang w:val="en-US" w:eastAsia="zh-CN"/>
               </w:rPr>
-              <w:t xml:space="preserve">门禁联动控制接口</w:t>
+              <w:t xml:space="preserve">系统部署与联调</w:t>
             </w:r>
           </w:p>
         </w:tc>
@@ -19982,7 +18814,7 @@
                 <w:szCs w:val="18"/>
                 <w:lang w:val="en-US" w:eastAsia="zh-CN"/>
               </w:rPr>
-              <w:t xml:space="preserve">调度指令与智能门禁的开关门联动控制</w:t>
+              <w:t xml:space="preserve">系统部署、配置、全流程联调与试运行保障</w:t>
             </w:r>
           </w:p>
         </w:tc>
@@ -20087,7 +18919,7 @@
                 <w:szCs w:val="18"/>
                 <w:lang w:val="en-US" w:eastAsia="zh-CN"/>
               </w:rPr>
-              <w:t xml:space="preserve">10,000</w:t>
+              <w:t xml:space="preserve">20,000</w:t>
             </w:r>
           </w:p>
         </w:tc>
@@ -20122,7 +18954,7 @@
                 <w:szCs w:val="18"/>
                 <w:lang w:val="en-US" w:eastAsia="zh-CN"/>
               </w:rPr>
-              <w:t xml:space="preserve">10,000</w:t>
+              <w:t xml:space="preserve">20,000</w:t>
             </w:r>
           </w:p>
         </w:tc>
@@ -20233,7 +19065,7 @@
                 <w:szCs w:val="18"/>
                 <w:lang w:val="en-US" w:eastAsia="zh-CN"/>
               </w:rPr>
-              <w:t xml:space="preserve">28</w:t>
+              <w:t xml:space="preserve">23</w:t>
             </w:r>
           </w:p>
         </w:tc>
@@ -20268,7 +19100,7 @@
                 <w:szCs w:val="18"/>
                 <w:lang w:val="en-US" w:eastAsia="zh-CN"/>
               </w:rPr>
-              <w:t xml:space="preserve">系统部署与联调</w:t>
+              <w:t xml:space="preserve">培训服务</w:t>
             </w:r>
           </w:p>
         </w:tc>
@@ -20303,7 +19135,7 @@
                 <w:szCs w:val="18"/>
                 <w:lang w:val="en-US" w:eastAsia="zh-CN"/>
               </w:rPr>
-              <w:t xml:space="preserve">系统部署、配置、全流程联调与试运行保障</w:t>
+              <w:t xml:space="preserve">面向委托前台人员、试验人员与管理人员的操作培训</w:t>
             </w:r>
           </w:p>
         </w:tc>
@@ -20338,7 +19170,7 @@
                 <w:szCs w:val="18"/>
                 <w:lang w:val="en-US" w:eastAsia="zh-CN"/>
               </w:rPr>
-              <w:t xml:space="preserve">项</w:t>
+              <w:t xml:space="preserve">次</w:t>
             </w:r>
           </w:p>
         </w:tc>
@@ -20373,7 +19205,7 @@
                 <w:szCs w:val="18"/>
                 <w:lang w:val="en-US" w:eastAsia="zh-CN"/>
               </w:rPr>
-              <w:t xml:space="preserve">1</w:t>
+              <w:t xml:space="preserve">2</w:t>
             </w:r>
           </w:p>
         </w:tc>
@@ -20408,7 +19240,7 @@
                 <w:szCs w:val="18"/>
                 <w:lang w:val="en-US" w:eastAsia="zh-CN"/>
               </w:rPr>
-              <w:t xml:space="preserve">20,000</w:t>
+              <w:t xml:space="preserve">5,000</w:t>
             </w:r>
           </w:p>
         </w:tc>
@@ -20443,7 +19275,7 @@
                 <w:szCs w:val="18"/>
                 <w:lang w:val="en-US" w:eastAsia="zh-CN"/>
               </w:rPr>
-              <w:t xml:space="preserve">20,000</w:t>
+              <w:t xml:space="preserve">10,000</w:t>
             </w:r>
           </w:p>
         </w:tc>
@@ -20519,7 +19351,7 @@
                 <w:szCs w:val="18"/>
                 <w:lang w:val="en-US" w:eastAsia="zh-CN"/>
               </w:rPr>
-              <w:t xml:space="preserve">实施服务</w:t>
+              <w:t xml:space="preserve">软件小计</w:t>
             </w:r>
           </w:p>
         </w:tc>
@@ -20554,7 +19386,7 @@
                 <w:szCs w:val="18"/>
                 <w:lang w:val="en-US" w:eastAsia="zh-CN"/>
               </w:rPr>
-              <w:t xml:space="preserve">29</w:t>
+              <w:t xml:space="preserve"/>
             </w:r>
           </w:p>
         </w:tc>
@@ -20589,7 +19421,7 @@
                 <w:szCs w:val="18"/>
                 <w:lang w:val="en-US" w:eastAsia="zh-CN"/>
               </w:rPr>
-              <w:t xml:space="preserve">培训服务</w:t>
+              <w:t xml:space="preserve"/>
             </w:r>
           </w:p>
         </w:tc>
@@ -20624,7 +19456,7 @@
                 <w:szCs w:val="18"/>
                 <w:lang w:val="en-US" w:eastAsia="zh-CN"/>
               </w:rPr>
-              <w:t xml:space="preserve">面向委托前台人员、试验人员与管理人员的操作培训</w:t>
+              <w:t xml:space="preserve"/>
             </w:r>
           </w:p>
         </w:tc>
@@ -20659,7 +19491,7 @@
                 <w:szCs w:val="18"/>
                 <w:lang w:val="en-US" w:eastAsia="zh-CN"/>
               </w:rPr>
-              <w:t xml:space="preserve">次</w:t>
+              <w:t xml:space="preserve"/>
             </w:r>
           </w:p>
         </w:tc>
@@ -20694,7 +19526,7 @@
                 <w:szCs w:val="18"/>
                 <w:lang w:val="en-US" w:eastAsia="zh-CN"/>
               </w:rPr>
-              <w:t xml:space="preserve">2</w:t>
+              <w:t xml:space="preserve"/>
             </w:r>
           </w:p>
         </w:tc>
@@ -20729,7 +19561,7 @@
                 <w:szCs w:val="18"/>
                 <w:lang w:val="en-US" w:eastAsia="zh-CN"/>
               </w:rPr>
-              <w:t xml:space="preserve">5,000</w:t>
+              <w:t xml:space="preserve"/>
             </w:r>
           </w:p>
         </w:tc>
@@ -20764,328 +19596,7 @@
                 <w:szCs w:val="18"/>
                 <w:lang w:val="en-US" w:eastAsia="zh-CN"/>
               </w:rPr>
-              <w:t xml:space="preserve">10,000</w:t>
-            </w:r>
-          </w:p>
-        </w:tc>
-        <w:tc>
-          <w:tcPr>
-            <w:tcW w:w="914" w:type="dxa"/>
-            <w:tcMar>
-              <w:top w:w="100" w:type="dxa"/>
-              <w:left w:w="60" w:type="dxa"/>
-              <w:bottom w:w="100" w:type="dxa"/>
-              <w:right w:w="60" w:type="dxa"/>
-            </w:tcMar>
-            <w:vAlign w:val="center"/>
-          </w:tcPr>
-          <w:p>
-            <w:pPr>
-              <w:spacing w:before="0" w:after="0" w:line="269" w:lineRule="auto"/>
-              <w:jc w:val="left"/>
-              <w:rPr>
-                <w:rFonts w:hint="eastAsia" w:ascii="宋体" w:hAnsi="宋体" w:eastAsia="宋体" w:cs="宋体"/>
-                <w:color w:val="000000"/>
-                <w:sz w:val="18"/>
-                <w:szCs w:val="18"/>
-                <w:lang w:val="en-US" w:eastAsia="zh-CN"/>
-              </w:rPr>
-            </w:pPr>
-            <w:r>
-              <w:rPr>
-                <w:rFonts w:hint="eastAsia" w:ascii="宋体" w:hAnsi="宋体" w:eastAsia="宋体" w:cs="宋体"/>
-                <w:color w:val="000000"/>
-                <w:sz w:val="18"/>
-                <w:szCs w:val="18"/>
-                <w:lang w:val="en-US" w:eastAsia="zh-CN"/>
-              </w:rPr>
-              <w:t xml:space="preserve"/>
-            </w:r>
-          </w:p>
-        </w:tc>
-      </w:tr>
-      <w:tr>
-        <w:trPr>
-          <w:cantSplit/>
-          <w:jc w:val="center"/>
-        </w:trPr>
-        <w:tc>
-          <w:tcPr>
-            <w:tcW w:w="672" w:type="dxa"/>
-            <w:tcMar>
-              <w:top w:w="100" w:type="dxa"/>
-              <w:left w:w="60" w:type="dxa"/>
-              <w:bottom w:w="100" w:type="dxa"/>
-              <w:right w:w="60" w:type="dxa"/>
-            </w:tcMar>
-            <w:vAlign w:val="center"/>
-          </w:tcPr>
-          <w:p>
-            <w:pPr>
-              <w:spacing w:before="0" w:after="0" w:line="269" w:lineRule="auto"/>
-              <w:jc w:val="center"/>
-              <w:rPr>
-                <w:rFonts w:hint="eastAsia" w:ascii="宋体" w:hAnsi="宋体" w:eastAsia="宋体" w:cs="宋体"/>
-                <w:color w:val="000000"/>
-                <w:sz w:val="18"/>
-                <w:szCs w:val="18"/>
-                <w:lang w:val="en-US" w:eastAsia="zh-CN"/>
-              </w:rPr>
-            </w:pPr>
-            <w:r>
-              <w:rPr>
-                <w:rFonts w:hint="eastAsia" w:ascii="宋体" w:hAnsi="宋体" w:eastAsia="宋体" w:cs="宋体"/>
-                <w:color w:val="000000"/>
-                <w:sz w:val="18"/>
-                <w:szCs w:val="18"/>
-                <w:lang w:val="en-US" w:eastAsia="zh-CN"/>
-              </w:rPr>
-              <w:t xml:space="preserve">软件小计</w:t>
-            </w:r>
-          </w:p>
-        </w:tc>
-        <w:tc>
-          <w:tcPr>
-            <w:tcW w:w="480" w:type="dxa"/>
-            <w:tcMar>
-              <w:top w:w="100" w:type="dxa"/>
-              <w:left w:w="60" w:type="dxa"/>
-              <w:bottom w:w="100" w:type="dxa"/>
-              <w:right w:w="60" w:type="dxa"/>
-            </w:tcMar>
-            <w:vAlign w:val="center"/>
-          </w:tcPr>
-          <w:p>
-            <w:pPr>
-              <w:spacing w:before="0" w:after="0" w:line="269" w:lineRule="auto"/>
-              <w:jc w:val="left"/>
-              <w:rPr>
-                <w:rFonts w:hint="eastAsia" w:ascii="宋体" w:hAnsi="宋体" w:eastAsia="宋体" w:cs="宋体"/>
-                <w:color w:val="000000"/>
-                <w:sz w:val="18"/>
-                <w:szCs w:val="18"/>
-                <w:lang w:val="en-US" w:eastAsia="zh-CN"/>
-              </w:rPr>
-            </w:pPr>
-            <w:r>
-              <w:rPr>
-                <w:rFonts w:hint="eastAsia" w:ascii="宋体" w:hAnsi="宋体" w:eastAsia="宋体" w:cs="宋体"/>
-                <w:color w:val="000000"/>
-                <w:sz w:val="18"/>
-                <w:szCs w:val="18"/>
-                <w:lang w:val="en-US" w:eastAsia="zh-CN"/>
-              </w:rPr>
-              <w:t xml:space="preserve"/>
-            </w:r>
-          </w:p>
-        </w:tc>
-        <w:tc>
-          <w:tcPr>
-            <w:tcW w:w="912" w:type="dxa"/>
-            <w:tcMar>
-              <w:top w:w="100" w:type="dxa"/>
-              <w:left w:w="60" w:type="dxa"/>
-              <w:bottom w:w="100" w:type="dxa"/>
-              <w:right w:w="60" w:type="dxa"/>
-            </w:tcMar>
-            <w:vAlign w:val="center"/>
-          </w:tcPr>
-          <w:p>
-            <w:pPr>
-              <w:spacing w:before="0" w:after="0" w:line="269" w:lineRule="auto"/>
-              <w:jc w:val="left"/>
-              <w:rPr>
-                <w:rFonts w:hint="eastAsia" w:ascii="宋体" w:hAnsi="宋体" w:eastAsia="宋体" w:cs="宋体"/>
-                <w:color w:val="000000"/>
-                <w:sz w:val="18"/>
-                <w:szCs w:val="18"/>
-                <w:lang w:val="en-US" w:eastAsia="zh-CN"/>
-              </w:rPr>
-            </w:pPr>
-            <w:r>
-              <w:rPr>
-                <w:rFonts w:hint="eastAsia" w:ascii="宋体" w:hAnsi="宋体" w:eastAsia="宋体" w:cs="宋体"/>
-                <w:color w:val="000000"/>
-                <w:sz w:val="18"/>
-                <w:szCs w:val="18"/>
-                <w:lang w:val="en-US" w:eastAsia="zh-CN"/>
-              </w:rPr>
-              <w:t xml:space="preserve"/>
-            </w:r>
-          </w:p>
-        </w:tc>
-        <w:tc>
-          <w:tcPr>
-            <w:tcW w:w="2400" w:type="dxa"/>
-            <w:tcMar>
-              <w:top w:w="100" w:type="dxa"/>
-              <w:left w:w="60" w:type="dxa"/>
-              <w:bottom w:w="100" w:type="dxa"/>
-              <w:right w:w="60" w:type="dxa"/>
-            </w:tcMar>
-            <w:vAlign w:val="center"/>
-          </w:tcPr>
-          <w:p>
-            <w:pPr>
-              <w:spacing w:before="0" w:after="0" w:line="269" w:lineRule="auto"/>
-              <w:jc w:val="left"/>
-              <w:rPr>
-                <w:rFonts w:hint="eastAsia" w:ascii="宋体" w:hAnsi="宋体" w:eastAsia="宋体" w:cs="宋体"/>
-                <w:color w:val="000000"/>
-                <w:sz w:val="18"/>
-                <w:szCs w:val="18"/>
-                <w:lang w:val="en-US" w:eastAsia="zh-CN"/>
-              </w:rPr>
-            </w:pPr>
-            <w:r>
-              <w:rPr>
-                <w:rFonts w:hint="eastAsia" w:ascii="宋体" w:hAnsi="宋体" w:eastAsia="宋体" w:cs="宋体"/>
-                <w:color w:val="000000"/>
-                <w:sz w:val="18"/>
-                <w:szCs w:val="18"/>
-                <w:lang w:val="en-US" w:eastAsia="zh-CN"/>
-              </w:rPr>
-              <w:t xml:space="preserve"/>
-            </w:r>
-          </w:p>
-        </w:tc>
-        <w:tc>
-          <w:tcPr>
-            <w:tcW w:w="432" w:type="dxa"/>
-            <w:tcMar>
-              <w:top w:w="100" w:type="dxa"/>
-              <w:left w:w="60" w:type="dxa"/>
-              <w:bottom w:w="100" w:type="dxa"/>
-              <w:right w:w="60" w:type="dxa"/>
-            </w:tcMar>
-            <w:vAlign w:val="center"/>
-          </w:tcPr>
-          <w:p>
-            <w:pPr>
-              <w:spacing w:before="0" w:after="0" w:line="269" w:lineRule="auto"/>
-              <w:jc w:val="left"/>
-              <w:rPr>
-                <w:rFonts w:hint="eastAsia" w:ascii="宋体" w:hAnsi="宋体" w:eastAsia="宋体" w:cs="宋体"/>
-                <w:color w:val="000000"/>
-                <w:sz w:val="18"/>
-                <w:szCs w:val="18"/>
-                <w:lang w:val="en-US" w:eastAsia="zh-CN"/>
-              </w:rPr>
-            </w:pPr>
-            <w:r>
-              <w:rPr>
-                <w:rFonts w:hint="eastAsia" w:ascii="宋体" w:hAnsi="宋体" w:eastAsia="宋体" w:cs="宋体"/>
-                <w:color w:val="000000"/>
-                <w:sz w:val="18"/>
-                <w:szCs w:val="18"/>
-                <w:lang w:val="en-US" w:eastAsia="zh-CN"/>
-              </w:rPr>
-              <w:t xml:space="preserve"/>
-            </w:r>
-          </w:p>
-        </w:tc>
-        <w:tc>
-          <w:tcPr>
-            <w:tcW w:w="528" w:type="dxa"/>
-            <w:tcMar>
-              <w:top w:w="100" w:type="dxa"/>
-              <w:left w:w="60" w:type="dxa"/>
-              <w:bottom w:w="100" w:type="dxa"/>
-              <w:right w:w="60" w:type="dxa"/>
-            </w:tcMar>
-            <w:vAlign w:val="center"/>
-          </w:tcPr>
-          <w:p>
-            <w:pPr>
-              <w:spacing w:before="0" w:after="0" w:line="269" w:lineRule="auto"/>
-              <w:jc w:val="left"/>
-              <w:rPr>
-                <w:rFonts w:hint="eastAsia" w:ascii="宋体" w:hAnsi="宋体" w:eastAsia="宋体" w:cs="宋体"/>
-                <w:color w:val="000000"/>
-                <w:sz w:val="18"/>
-                <w:szCs w:val="18"/>
-                <w:lang w:val="en-US" w:eastAsia="zh-CN"/>
-              </w:rPr>
-            </w:pPr>
-            <w:r>
-              <w:rPr>
-                <w:rFonts w:hint="eastAsia" w:ascii="宋体" w:hAnsi="宋体" w:eastAsia="宋体" w:cs="宋体"/>
-                <w:color w:val="000000"/>
-                <w:sz w:val="18"/>
-                <w:szCs w:val="18"/>
-                <w:lang w:val="en-US" w:eastAsia="zh-CN"/>
-              </w:rPr>
-              <w:t xml:space="preserve"/>
-            </w:r>
-          </w:p>
-        </w:tc>
-        <w:tc>
-          <w:tcPr>
-            <w:tcW w:w="960" w:type="dxa"/>
-            <w:tcMar>
-              <w:top w:w="100" w:type="dxa"/>
-              <w:left w:w="60" w:type="dxa"/>
-              <w:bottom w:w="100" w:type="dxa"/>
-              <w:right w:w="60" w:type="dxa"/>
-            </w:tcMar>
-            <w:vAlign w:val="center"/>
-          </w:tcPr>
-          <w:p>
-            <w:pPr>
-              <w:spacing w:before="0" w:after="0" w:line="269" w:lineRule="auto"/>
-              <w:jc w:val="left"/>
-              <w:rPr>
-                <w:rFonts w:hint="eastAsia" w:ascii="宋体" w:hAnsi="宋体" w:eastAsia="宋体" w:cs="宋体"/>
-                <w:color w:val="000000"/>
-                <w:sz w:val="18"/>
-                <w:szCs w:val="18"/>
-                <w:lang w:val="en-US" w:eastAsia="zh-CN"/>
-              </w:rPr>
-            </w:pPr>
-            <w:r>
-              <w:rPr>
-                <w:rFonts w:hint="eastAsia" w:ascii="宋体" w:hAnsi="宋体" w:eastAsia="宋体" w:cs="宋体"/>
-                <w:color w:val="000000"/>
-                <w:sz w:val="18"/>
-                <w:szCs w:val="18"/>
-                <w:lang w:val="en-US" w:eastAsia="zh-CN"/>
-              </w:rPr>
-              <w:t xml:space="preserve"/>
-            </w:r>
-          </w:p>
-        </w:tc>
-        <w:tc>
-          <w:tcPr>
-            <w:tcW w:w="1008" w:type="dxa"/>
-            <w:tcMar>
-              <w:top w:w="100" w:type="dxa"/>
-              <w:left w:w="60" w:type="dxa"/>
-              <w:bottom w:w="100" w:type="dxa"/>
-              <w:right w:w="60" w:type="dxa"/>
-            </w:tcMar>
-            <w:vAlign w:val="center"/>
-          </w:tcPr>
-          <w:p>
-            <w:pPr>
-              <w:spacing w:before="0" w:after="0" w:line="269" w:lineRule="auto"/>
-              <w:jc w:val="left"/>
-              <w:rPr>
-                <w:rFonts w:hint="eastAsia" w:ascii="宋体" w:hAnsi="宋体" w:eastAsia="宋体" w:cs="宋体"/>
-                <w:color w:val="000000"/>
-                <w:sz w:val="18"/>
-                <w:szCs w:val="18"/>
-                <w:lang w:val="en-US" w:eastAsia="zh-CN"/>
-              </w:rPr>
-            </w:pPr>
-            <w:r>
-              <w:rPr>
-                <w:rFonts w:hint="eastAsia" w:ascii="宋体" w:hAnsi="宋体" w:eastAsia="宋体" w:cs="宋体"/>
-                <w:color w:val="000000"/>
-                <w:sz w:val="18"/>
-                <w:szCs w:val="18"/>
-                <w:lang w:val="en-US" w:eastAsia="zh-CN"/>
-              </w:rPr>
-              <w:t xml:space="preserve">556,000</w:t>
+              <w:t xml:space="preserve">516,000</w:t>
             </w:r>
           </w:p>
         </w:tc>

</xml_diff>